<commit_message>
cascade: chore(constitution): bump submodule pointer to 6d4c2fde67b (codegraph watcher/scope fixes + upstream churn)
Advances the constitution submodule pointer per §11.4.26 step 7. Picks up
this session's own commit (feat(codegraph): fix watcher cold-start race +
scope false-positive allowlist) plus independent upstream commits landed
concurrently by other work (CM-DANGEROUS-COMBINATION-FAIL-CLOSED gate
coverage, skill-activation host-CLI wrapper, gate-ledger-ratchet fix,
OD_VISREG_GLOBS globstar fix).

(committed by parent commit_all.sh cascade depth=1)
</commit_message>
<xml_diff>
--- a/GEMINI.docx
+++ b/GEMINI.docx
@@ -67,7 +67,7 @@
               <w:pStyle w:val="Compact"/>
             </w:pPr>
             <w:r>
-              <w:t xml:space="preserve">38</w:t>
+              <w:t xml:space="preserve">39</w:t>
             </w:r>
           </w:p>
         </w:tc>
@@ -115,7 +115,7 @@
               <w:pStyle w:val="Compact"/>
             </w:pPr>
             <w:r>
-              <w:t xml:space="preserve">2026-08-26T11:55:02Z</w:t>
+              <w:t xml:space="preserve">2026-09-24T12:03:59Z</w:t>
             </w:r>
           </w:p>
         </w:tc>
@@ -163,118 +163,7 @@
               <w:pStyle w:val="Compact"/>
             </w:pPr>
             <w:r>
-              <w:t xml:space="preserve">Amendment of 2026-08-26 — SPECKIT 002-anti-slop-enforcement T402/T403/T404: 4 NEW universal anchors §11.4.268 (tamper-evident evidence chain + periodic anchor record: deletion, reordering and tail-truncation of an evidence chain are DETECTED, not merely discouraged) / §11.4.269 (critic/consensus advisory-only ban AT THE EVIDENCE-ACCEPTANCE SEAM: an ungoverned confidence or consensus score never substitutes for a machine-written verdict) / §11.4.270 (dependency-existence-verdict register: every proposed dependency carries a closed-set existence verdict, so a hallucinated package cannot be adopted silently) / §11.4.271 (waiver mechanism: the strict FORMALIZATION of allow-with-tracked-debt, unifying §11.4.234(D)'s recorded deferral with the §11.4.135 ratchet), plus 3 EXTENSIONS landed INSIDE existing bodies per §11.4.227 extend-don't-restate — §11.4.115 clause (H) (evidence-record full field set + stream-digest-before-truncation + recorder reconciliation), a titled EXTENSION block in §11.4.238 (discovery-channel record schema + escape-ratchet no-data-point rule), and §11.4.240 clause (F) (independence-tier vocabulary + Tier-C capability-separation triggers, degrading honestly on a single-uid host). The 4 NEW anchors are mirrored byte-identically into CLAUDE.md / AGENTS.md / QWEN.md / GEMINI.md (T403, all PASS, per-anchor content hashes agree); anchor-block integrity verified by TWO independent instruments that must agree (T404, both rc=0). HONEST BOUNDARY (§11.4.6): the 3 EXTENSIONS were deliberately NOT propagated to the mirrors in this change — syncing §11.4.115 would additionally overwrite pre-existing divergent mirror wording and insert the block currently MISSING from GEMINI.md (a pre-existing §11.4.157 lockstep violation, tracked, outside this change's authorization); that mirror gap for §11.4.115/238/240 is RECORDED as owed, not left implicit. Gate-code for the recommended CM-* mechanism gates is a separate work item and is NOT claimed shipped (§11.4.6/§11.4.227). Amendment of 2026-08-15 — MONOLITHIC ROUND: 22 NEW universal anchors (§11.4.239-254 AI-curriculum modules 27-35 harvest + §11.4.257-262 enterprise-quality 9-point mandate) + 5 targeted extensions (§11.4.212 EXT clauses (E)/(F) README intro+illustration + linkage-completeness ratchet; §11.4 covenant preamble EXT machine-created evidence at every gate binding; §11.4.108 EXT clause (7) machine-created evidence at every layer; §11.4.224 EXT (B) 7-canonical-type coverage floor + 100% aim; §11.4.27 EXT (B) 7-canonical-type breadth enumeration). §11.4.239 critical-invariant DoD money/safety/availability/integrity failure-path scenarios as gates; §11.4.240 producer≠verifier scope separation via least-privilege-not-instruction; §11.4.241 illegal-state-unrepresentability preference ladder (types→API-shape→lint→property-test→runtime-assert); §11.4.242 bisection-not-blame regression cause-finding + failure-mode catalogue; §11.4.243 characterization/golden-master safety net before behaviour-changing legacy modification; §11.4.244 cross-boundary contract tests + can-i-deploy gate merged; §11.4.245 oracle-problem-first test authoring with named strategy + independence; §11.4.246 reproducible + hermetic builds + SLSA Build Level 2 fleet-wide minimum + supply-chain integrity chain; §11.4.247 composite-output layer-move must move every layer with completeness check + compatibility window; §11.4.248 flaky-test quarantine + [PROTECTED-SPEC: ATM-NNN] tag + CODEOWNERS required reviewer; §11.4.249 producer≠oracle≠gate≠verifier four-role separation + flight recorder; §11.4.250 heuristic-tower signals a primitive defect requiring systematic-debug not layer N+1; §11.4.251 byte-identical-fork prohibition + role-as-data-pack extraction; §11.4.252 fail-closed-on-dangerous-combination for ≥2 mutation/untrusted-input/credential/side-effect/exec/irreversible capabilities; §11.4.253 idempotency under retry with DB-level durable uniqueness guard; §11.4.254 boot-time invariant assertion + capability matrix; §11.4.257 comprehensive user-manual + guide + FAQ coverage per component/service/feature; §11.4.258 architectural + data-flow + state-machine + sequence-diagram coverage embedded not orphan; §11.4.259 README quality-status badge row with closed green→amber→red vocabulary + machine-derived + production-readiness gauge; §11.4.260 cutting-edge enterprise quality + production-deployment readiness 10-invariant tracker; §11.4.261 zero-shortcomings/gaps/weak-spots/danger-zones invariant + mechanical audit ratchet monotone-decreasing; §11.4.262 machine-created evidence at every gate binding covenant preamble universally. SUBSTRATE-GAP DISCLOSURE per §11.4.231(F)(b) honest boundary: the §11.4.209 review substrate for this round ran on the opus-class parent-inherited fork substrate (the Claude Code Agent tool exposes a</w:t>
-            </w:r>
-            <w:r>
-              <w:t xml:space="preserve"> </w:t>
-            </w:r>
-            <w:r>
-              <w:rPr>
-                <w:rStyle w:val="VerbatimChar"/>
-              </w:rPr>
-              <w:t xml:space="preserve">model</w:t>
-            </w:r>
-            <w:r>
-              <w:t xml:space="preserve"> </w:t>
-            </w:r>
-            <w:r>
-              <w:t xml:space="preserve">parameter but NO</w:t>
-            </w:r>
-            <w:r>
-              <w:t xml:space="preserve"> </w:t>
-            </w:r>
-            <w:r>
-              <w:rPr>
-                <w:rStyle w:val="VerbatimChar"/>
-              </w:rPr>
-              <w:t xml:space="preserve">effort</w:t>
-            </w:r>
-            <w:r>
-              <w:t xml:space="preserve"> </w:t>
-            </w:r>
-            <w:r>
-              <w:t xml:space="preserve">parameter, so subagent effort is not presently settable via that path — the label</w:t>
-            </w:r>
-            <w:r>
-              <w:t xml:space="preserve"> </w:t>
-            </w:r>
-            <w:r>
-              <w:rPr>
-                <w:rStyle w:val="VerbatimChar"/>
-              </w:rPr>
-              <w:t xml:space="preserve">&lt;effort&gt;</w:t>
-            </w:r>
-            <w:r>
-              <w:t xml:space="preserve"> </w:t>
-            </w:r>
-            <w:r>
-              <w:t xml:space="preserve">field degrades honestly to</w:t>
-            </w:r>
-            <w:r>
-              <w:t xml:space="preserve"> </w:t>
-            </w:r>
-            <w:r>
-              <w:rPr>
-                <w:rStyle w:val="VerbatimChar"/>
-              </w:rPr>
-              <w:t xml:space="preserve">?</w:t>
-            </w:r>
-            <w:r>
-              <w:t xml:space="preserve">) — SUBSTANTIVE on structural/traceability/composes/anti-bluff/classification/collision/cross-anchor/no-escape-hatch axes with clean GO on round 2 (subagent a6b89ff0, all IMPORTANT-1/2/3 + MINOR-1/2/3/4 findings resolved, zero new BLOCKING or IMPORTANT introduced); a re-review at the true §11.4.209 Fable-</w:t>
-            </w:r>
-            <w:r>
-              <w:rPr>
-                <w:rStyle w:val="VerbatimChar"/>
-              </w:rPr>
-              <w:t xml:space="preserve">xhigh</w:t>
-            </w:r>
-            <w:r>
-              <w:t xml:space="preserve"> </w:t>
-            </w:r>
-            <w:r>
-              <w:t xml:space="preserve">substrate via the Workflow-tool</w:t>
-            </w:r>
-            <w:r>
-              <w:t xml:space="preserve"> </w:t>
-            </w:r>
-            <w:r>
-              <w:rPr>
-                <w:rStyle w:val="VerbatimChar"/>
-              </w:rPr>
-              <w:t xml:space="preserve">agent()</w:t>
-            </w:r>
-            <w:r>
-              <w:t xml:space="preserve"> </w:t>
-            </w:r>
-            <w:r>
-              <w:t xml:space="preserve">path REMAINS RECOMMENDED (not blocking) before the anchors are considered fully substrate-verified — tracked as an owed §11.4.197 upgrade item, never a claim of shipped Fable-xhigh review. Classification: universal (§11.4.17). Propagation gates CM-COVENANT-114-239 through CM-COVENANT-114-254 + CM-COVENANT-114-257 through CM-COVENANT-114-262 (14 anchor-block-start propagation gates + 6 more) + recommended mechanism gates enumerated per anchor + paired §1.1 mutations (gate-code = separate work item, NOT claimed shipped §11.4.6/§11.4.227). §11.4.239-254 + §11.4.257-262 amendment region byte-identical across the 4 mirrors CLAUDE.md + AGENTS.md + QWEN.md + GEMINI.md per §11.4.157 lockstep; Constitution.md carries the canonical ### §11.4.NNN heading variant per §11.4.227(B) canonical-vs-mirror layer variance legitimate. All 22 new anchors exactly-once block-start per file per §11.4.227(B). Generated .html/.pdf/.docx twins NOT regenerated (exporter still not a runnable in-repo script — honestly STALE per §11.4.106(E)). Prior round: Amendment of 2026-08-05 — NEW universal anchor §11.4.237 (operator mandate 2026-08-05): every translation / translated artifact (UI strings, pages, documents, PDFs, any localized content) MUST undergo a HEAVY, EXHAUSTIVE, INDEPENDENT context-and-spirit-aware review by a reviewer STRUCTURALLY SEPARATE from the translator (never self-review — §11.4.92 precedes, §11.4.142 never satisfies); the reviewer holds + applies (a) full CONTEXT of the source material (original ideas / subject-domain / purpose / audience), (b) the SPIRIT / idiom / register / tradition / cultural-conventions of the TARGET language so the result reads NATIVE + natural + maximally polished, never literal/word-for-word/calqued, and (c) correct TECHNICAL vocabulary + VERBATIM preservation of NON-TRANSLATABLE terms (product/brand/proper names, technology/library/API names, code identifiers); goal = maximally slick, polished, professional localization — accuracy NECESSARY, never SUFFICIENT; anti-bluff — captured machine-readable POSITIVE evidence (verdict + per-dimension rationale across {fidelity, fluency/naturalness, spirit/register, terminology, completeness, non-translatable-preservation}, feature_class=translation_review, §11.4.5/§11.4.69) and a FAIL on any dimension loops back to re-translation/polish until a zero-finding clean verdict (§11.4.134). REFINES §11.4.255 (canonical translation pipeline) / §11.4.256 (independent per-language translation review — from PASS/FAIL accuracy to context+spirit native polish; the KNOWN §11.4.54 anchor-number collision on 11.4.140/11.4.141 cited strictly in those senses — re-mint RESOLVED 2026-08-15 (operator-owned decision executed: HelixTranslate canonical translation pipeline → §11.4.255, independent per-language translation review → §11.4.256; Constitution.md 5ed8c80 + mirrors CLAUDE 6dff307 / AGENTS f497412 / QWEN 9e45dec / GEMINI e5f2891), NO new collision introduced). Classification: universal (§11.4.17). Propagation gate CM-COVENANT-114-237-PROPAGATION + recommended gate CM-TRANSLATION-CONTEXT-SPIRIT-REVIEW + paired §1.1 mutation (accuracy-only check / self-reviewed-by-own-translator / golden-bad mistranslated-idiom or "translated" non-translatable product name → gate FAILs; gate-code = separate work item, NOT claimed shipped §11.4.6/§11.4.227). §11.4.237 amendment region byte-identical across the 4 mirrors CLAUDE.md + AGENTS.md + QWEN.md + GEMINI.md (full-block md5 05d4e829de58414ca8f7ce920b606173, §11.4.157 lockstep); Constitution.md carries the canonical ###-heading variant (identical body md5 8f518d2f25d8c61a94b114c32c2db308 — §11.4.227(B) canonical-vs-mirror layer variance legitimate, content-hash equality binds within the lockstep set); §11.4.237 exactly-once block-start per file (§11.4.227(B)), no anchor-number collision. Generated .html/.pdf/.docx twins NOT regenerated (exporter still not a runnable in-repo script — honestly STALE per §11.4.106(E)). Prior round: Amendment of 2026-07-26 — NEW universal anchor §11.4.234 (operator mandate 2026-07-26, verbatim: "We MUST have dedicated script to run hook validations, and commit and push mechanism ALWAYS unblocked!"): hook validations run as an EXPLICIT stage of a dedicated, idempotent commit/push script (consumer-bound path as DATA per §11.4.35 — Lava binding: scripts/commit-push-all.sh); automatic git hooks wired via core.hooksPath MUST NOT gate routine commit/push (disconnect = hooksPath unset, hook file preserved UNMODIFIED, --no-verify never the routine path); NO gate is lost (every disconnected check remains executed at a named script stage or release/tag gate, silently dropping one is a §11.4 PASS-bluff at the process layer); the commit/push mechanism is ALWAYS unblocked (failing validation = clear per-check report + documented remediation path, long multi-minute gates separable from cheap checks and skippable ONLY via an explicit recorded deferral flag — Lava binding: LAVA_SYNC_SKIP_CI=1 — never an opaque hung/rejected push). Classification: universal (§11.4.17). Propagation gate CM-COVENANT-114-234-PROPAGATION + recommended mechanism gates CM-DEDICATED-HOOK-VALIDATION-SCRIPT / CM-HOOKS-NEVER-BLOCK-PUSH / CM-NO-GATE-LOST-ON-HOOK-DISCONNECT / CM-COMMIT-PUSH-ALWAYS-UNBLOCKED + paired §1.1 mutations (gate-code = separate work item, NOT claimed shipped §11.4.6/§11.4.227). Amendment region byte-identical across all 5 governance files (md5-verified); §11.4.234 exactly-once block-start per file (§11.4.227(B)), no anchor-number collision. CLAUDE.md + AGENTS.md + QWEN.md + GEMINI.md mirrors updated in lockstep (§11.4.157). Generated .html/.pdf/.docx twins NOT regenerated (exporter still not a runnable in-repo script — honestly STALE per §11.4.106(E)). Prior round: Amendment of 2026-07-26 — the EFFORT-tiering + 5-field-label batch (operator IMPORTANT mandate 2026-07-26, verbatim: "Besides dynamic determining proper models to use, we MUST decide the effort as well and switch between the effort settings same as we do now for chosen model! Labeling MUST BE extended for this details as well. Example: (T1/main - claude4 - opus - high)."). §11.4.182 EXTENSION amended (in-place, no re-mint): the work-stream label form extends from</w:t>
-            </w:r>
-            <w:r>
-              <w:t xml:space="preserve"> </w:t>
-            </w:r>
-            <w:r>
-              <w:rPr>
-                <w:rStyle w:val="VerbatimChar"/>
-              </w:rPr>
-              <w:t xml:space="preserve">(T&lt;N&gt;/&lt;branch&gt; - &lt;alias&gt; - &lt;model&gt;)</w:t>
-            </w:r>
-            <w:r>
-              <w:t xml:space="preserve"> </w:t>
-            </w:r>
-            <w:r>
-              <w:t xml:space="preserve">to</w:t>
-            </w:r>
-            <w:r>
-              <w:t xml:space="preserve"> </w:t>
-            </w:r>
-            <w:r>
-              <w:rPr>
-                <w:rStyle w:val="VerbatimChar"/>
-              </w:rPr>
-              <w:t xml:space="preserve">(T&lt;N&gt;/&lt;branch&gt; - &lt;alias&gt; - &lt;model&gt; - &lt;effort&gt;)</w:t>
-            </w:r>
-            <w:r>
-              <w:t xml:space="preserve">, effort ∈ {low</w:t>
+              <w:t xml:space="preserve">Amendment of 2026-09-24 — NEW §11.4.275 (semantic Lumen index + indexing-efficiency gate + universal agent/subagent accessibility) + EXTENSIONS §11.4.78(7)-(10) / §11.4.79(6)-(8) / §11.4.80(4)-(8): the indexing mechanism (scope renderer, single writer entry, version-keyed runner patches, scope proof, watchdog, lumen scope generator) is consumed BY REFERENCE from constitution/scripts/codegraph</w:t>
             </w:r>
           </w:p>
         </w:tc>
@@ -13229,6 +13118,388 @@
           <w:b/>
           <w:bCs/>
         </w:rPr>
+        <w:t xml:space="preserve">§11.4.184(I) — HawkScan + OWASP ZAP + gitleaks + Trivy extension (operator mandate, 2026-09-18).</w:t>
+      </w:r>
+      <w:r>
+        <w:t xml:space="preserve"> </w:t>
+      </w:r>
+      <w:r>
+        <w:t xml:space="preserve">Compact summary: extends §11.4.184's SonarQube tooling mandate to four more scanners, all consumed BY REFERENCE from this constitution submodule's</w:t>
+      </w:r>
+      <w:r>
+        <w:t xml:space="preserve"> </w:t>
+      </w:r>
+      <w:r>
+        <w:rPr>
+          <w:rStyle w:val="VerbatimChar"/>
+        </w:rPr>
+        <w:t xml:space="preserve">scripts/&lt;tool&gt;/</w:t>
+      </w:r>
+      <w:r>
+        <w:t xml:space="preserve"> </w:t>
+      </w:r>
+      <w:r>
+        <w:t xml:space="preserve">trees (never copied per project, same §11.4.28/§11.4.80-style inheritance as SonarQube): (1)</w:t>
+      </w:r>
+      <w:r>
+        <w:t xml:space="preserve"> </w:t>
+      </w:r>
+      <w:r>
+        <w:rPr>
+          <w:b/>
+          <w:bCs/>
+        </w:rPr>
+        <w:t xml:space="preserve">gitleaks</w:t>
+      </w:r>
+      <w:r>
+        <w:t xml:space="preserve"> </w:t>
+      </w:r>
+      <w:r>
+        <w:t xml:space="preserve">(secrets) and (2)</w:t>
+      </w:r>
+      <w:r>
+        <w:t xml:space="preserve"> </w:t>
+      </w:r>
+      <w:r>
+        <w:rPr>
+          <w:b/>
+          <w:bCs/>
+        </w:rPr>
+        <w:t xml:space="preserve">Trivy</w:t>
+      </w:r>
+      <w:r>
+        <w:t xml:space="preserve"> </w:t>
+      </w:r>
+      <w:r>
+        <w:t xml:space="preserve">(dependency/container/IaC vulns) — fully open-source, no account, install-check GREEN required, release blocker; (3)</w:t>
+      </w:r>
+      <w:r>
+        <w:t xml:space="preserve"> </w:t>
+      </w:r>
+      <w:r>
+        <w:rPr>
+          <w:b/>
+          <w:bCs/>
+        </w:rPr>
+        <w:t xml:space="preserve">OWASP ZAP</w:t>
+      </w:r>
+      <w:r>
+        <w:t xml:space="preserve"> </w:t>
+      </w:r>
+      <w:r>
+        <w:t xml:space="preserve">(DAST) — fully open-source, runs as a local rootless-podman container (§11.4.161), no SaaS dependency, release blocker; (4)</w:t>
+      </w:r>
+      <w:r>
+        <w:t xml:space="preserve"> </w:t>
+      </w:r>
+      <w:r>
+        <w:rPr>
+          <w:b/>
+          <w:bCs/>
+        </w:rPr>
+        <w:t xml:space="preserve">HawkScan</w:t>
+      </w:r>
+      <w:r>
+        <w:t xml:space="preserve"> </w:t>
+      </w:r>
+      <w:r>
+        <w:t xml:space="preserve">(DAST, StackHawk) — the ONE SaaS-backed tool in this set, no fully-local mode exists, requires an operator-only free-tier signup at</w:t>
+      </w:r>
+      <w:r>
+        <w:t xml:space="preserve"> </w:t>
+      </w:r>
+      <w:r>
+        <w:rPr>
+          <w:rStyle w:val="VerbatimChar"/>
+        </w:rPr>
+        <w:t xml:space="preserve">app.stackhawk.com</w:t>
+      </w:r>
+      <w:r>
+        <w:t xml:space="preserve"> </w:t>
+      </w:r>
+      <w:r>
+        <w:t xml:space="preserve">PLUS a per-project "Application" creation for its</w:t>
+      </w:r>
+      <w:r>
+        <w:t xml:space="preserve"> </w:t>
+      </w:r>
+      <w:r>
+        <w:rPr>
+          <w:rStyle w:val="VerbatimChar"/>
+        </w:rPr>
+        <w:t xml:space="preserve">applicationId</w:t>
+      </w:r>
+      <w:r>
+        <w:t xml:space="preserve"> </w:t>
+      </w:r>
+      <w:r>
+        <w:t xml:space="preserve">— neither automatable by any agent;</w:t>
+      </w:r>
+      <w:r>
+        <w:t xml:space="preserve"> </w:t>
+      </w:r>
+      <w:r>
+        <w:rPr>
+          <w:rStyle w:val="VerbatimChar"/>
+        </w:rPr>
+        <w:t xml:space="preserve">scripts/hawkscan/run.sh</w:t>
+      </w:r>
+      <w:r>
+        <w:t xml:space="preserve"> </w:t>
+      </w:r>
+      <w:r>
+        <w:t xml:space="preserve">MUST fail OPEN (exit 0 with a loud non-blocking warning) whenever</w:t>
+      </w:r>
+      <w:r>
+        <w:t xml:space="preserve"> </w:t>
+      </w:r>
+      <w:r>
+        <w:rPr>
+          <w:rStyle w:val="VerbatimChar"/>
+        </w:rPr>
+        <w:t xml:space="preserve">HAWK_API_KEY</w:t>
+      </w:r>
+      <w:r>
+        <w:t xml:space="preserve"> </w:t>
+      </w:r>
+      <w:r>
+        <w:t xml:space="preserve">is unset or the</w:t>
+      </w:r>
+      <w:r>
+        <w:t xml:space="preserve"> </w:t>
+      </w:r>
+      <w:r>
+        <w:rPr>
+          <w:rStyle w:val="VerbatimChar"/>
+        </w:rPr>
+        <w:t xml:space="preserve">applicationId</w:t>
+      </w:r>
+      <w:r>
+        <w:t xml:space="preserve"> </w:t>
+      </w:r>
+      <w:r>
+        <w:t xml:space="preserve">placeholder remains, never fail closed, and a missing third-party credential is an operator setup gap NEVER a build/gate failure. None of the four is declared in</w:t>
+      </w:r>
+      <w:r>
+        <w:t xml:space="preserve"> </w:t>
+      </w:r>
+      <w:r>
+        <w:rPr>
+          <w:rStyle w:val="VerbatimChar"/>
+        </w:rPr>
+        <w:t xml:space="preserve">helix-deps.yaml</w:t>
+      </w:r>
+      <w:r>
+        <w:t xml:space="preserve"> </w:t>
+      </w:r>
+      <w:r>
+        <w:t xml:space="preserve">(§11.4.31's schema is git-clonable-source-only; none of these four is one). Semgrep is deliberately NOT added here — §11.4.166's repeal in favor of SonarQube stands, unreversed. Step-by-step key-acquisition guides live at</w:t>
+      </w:r>
+      <w:r>
+        <w:t xml:space="preserve"> </w:t>
+      </w:r>
+      <w:r>
+        <w:rPr>
+          <w:rStyle w:val="VerbatimChar"/>
+        </w:rPr>
+        <w:t xml:space="preserve">scripts/hawkscan/README.md</w:t>
+      </w:r>
+      <w:r>
+        <w:t xml:space="preserve">. Classification: universal (§11.4.17). Composes §11.4.184/.166/.31/.28/.80/.161/.10/.6. Propagation gate</w:t>
+      </w:r>
+      <w:r>
+        <w:t xml:space="preserve"> </w:t>
+      </w:r>
+      <w:r>
+        <w:rPr>
+          <w:rStyle w:val="VerbatimChar"/>
+        </w:rPr>
+        <w:t xml:space="preserve">CM-COVENANT-114-184-PROPAGATION</w:t>
+      </w:r>
+      <w:r>
+        <w:t xml:space="preserve"> </w:t>
+      </w:r>
+      <w:r>
+        <w:t xml:space="preserve">(literal</w:t>
+      </w:r>
+      <w:r>
+        <w:t xml:space="preserve"> </w:t>
+      </w:r>
+      <w:r>
+        <w:rPr>
+          <w:rStyle w:val="VerbatimChar"/>
+        </w:rPr>
+        <w:t xml:space="preserve">11.4.184</w:t>
+      </w:r>
+      <w:r>
+        <w:t xml:space="preserve">, unchanged — same anchor) + recommended gates</w:t>
+      </w:r>
+      <w:r>
+        <w:t xml:space="preserve"> </w:t>
+      </w:r>
+      <w:r>
+        <w:rPr>
+          <w:rStyle w:val="VerbatimChar"/>
+        </w:rPr>
+        <w:t xml:space="preserve">CM-GITLEAKS-INSTALLED</w:t>
+      </w:r>
+      <w:r>
+        <w:t xml:space="preserve"> </w:t>
+      </w:r>
+      <w:r>
+        <w:t xml:space="preserve">/</w:t>
+      </w:r>
+      <w:r>
+        <w:t xml:space="preserve"> </w:t>
+      </w:r>
+      <w:r>
+        <w:rPr>
+          <w:rStyle w:val="VerbatimChar"/>
+        </w:rPr>
+        <w:t xml:space="preserve">CM-TRIVY-INSTALLED</w:t>
+      </w:r>
+      <w:r>
+        <w:t xml:space="preserve"> </w:t>
+      </w:r>
+      <w:r>
+        <w:t xml:space="preserve">/</w:t>
+      </w:r>
+      <w:r>
+        <w:t xml:space="preserve"> </w:t>
+      </w:r>
+      <w:r>
+        <w:rPr>
+          <w:rStyle w:val="VerbatimChar"/>
+        </w:rPr>
+        <w:t xml:space="preserve">CM-ZAP-CONTAINER-AVAILABLE</w:t>
+      </w:r>
+      <w:r>
+        <w:t xml:space="preserve"> </w:t>
+      </w:r>
+      <w:r>
+        <w:t xml:space="preserve">/</w:t>
+      </w:r>
+      <w:r>
+        <w:t xml:space="preserve"> </w:t>
+      </w:r>
+      <w:r>
+        <w:rPr>
+          <w:rStyle w:val="VerbatimChar"/>
+        </w:rPr>
+        <w:t xml:space="preserve">CM-HAWKSCAN-SCAFFOLDED</w:t>
+      </w:r>
+      <w:r>
+        <w:t xml:space="preserve"> </w:t>
+      </w:r>
+      <w:r>
+        <w:t xml:space="preserve">(HawkScan's gate proves fail-open scaffolding, NEVER a completed scan) + paired §1.1 mutations (move a tool off PATH → its install-check FAILs; neuter</w:t>
+      </w:r>
+      <w:r>
+        <w:t xml:space="preserve"> </w:t>
+      </w:r>
+      <w:r>
+        <w:rPr>
+          <w:rStyle w:val="VerbatimChar"/>
+        </w:rPr>
+        <w:t xml:space="preserve">hawkscan/run.sh</w:t>
+      </w:r>
+      <w:r>
+        <w:t xml:space="preserve">'s credential guard so it runs with no key → the mutation proof FAILs). Honest boundary §11.4.6 — this clause mandates tooling PRESENCE and local runnability, not that any scan ran or any finding was triaged; HawkScan can never be claimed "configured" by an agent alone.</w:t>
+      </w:r>
+      <w:r>
+        <w:t xml:space="preserve"> </w:t>
+      </w:r>
+      <w:r>
+        <w:rPr>
+          <w:b/>
+          <w:bCs/>
+        </w:rPr>
+        <w:t xml:space="preserve">Canonical authority:</w:t>
+      </w:r>
+      <w:r>
+        <w:t xml:space="preserve"> </w:t>
+      </w:r>
+      <w:r>
+        <w:t xml:space="preserve">constitution submodule</w:t>
+      </w:r>
+      <w:r>
+        <w:t xml:space="preserve"> </w:t>
+      </w:r>
+      <w:hyperlink r:id="rId10">
+        <w:r>
+          <w:rPr>
+            <w:rStyle w:val="VerbatimChar"/>
+          </w:rPr>
+          <w:t xml:space="preserve">Constitution.md</w:t>
+        </w:r>
+      </w:hyperlink>
+      <w:r>
+        <w:t xml:space="preserve"> </w:t>
+      </w:r>
+      <w:r>
+        <w:t xml:space="preserve">§11.4.184(I). Non-compliance is a release blocker for gitleaks/Trivy/ZAP; HawkScan's bar is "correctly scaffolded with a fail-open guard" until an operator completes the two manual account steps. No escape hatch — no</w:t>
+      </w:r>
+      <w:r>
+        <w:t xml:space="preserve"> </w:t>
+      </w:r>
+      <w:r>
+        <w:rPr>
+          <w:rStyle w:val="VerbatimChar"/>
+        </w:rPr>
+        <w:t xml:space="preserve">--skip-gitleaks</w:t>
+      </w:r>
+      <w:r>
+        <w:t xml:space="preserve">,</w:t>
+      </w:r>
+      <w:r>
+        <w:t xml:space="preserve"> </w:t>
+      </w:r>
+      <w:r>
+        <w:rPr>
+          <w:rStyle w:val="VerbatimChar"/>
+        </w:rPr>
+        <w:t xml:space="preserve">--trivy-optional</w:t>
+      </w:r>
+      <w:r>
+        <w:t xml:space="preserve">,</w:t>
+      </w:r>
+      <w:r>
+        <w:t xml:space="preserve"> </w:t>
+      </w:r>
+      <w:r>
+        <w:rPr>
+          <w:rStyle w:val="VerbatimChar"/>
+        </w:rPr>
+        <w:t xml:space="preserve">--zap-off</w:t>
+      </w:r>
+      <w:r>
+        <w:t xml:space="preserve">,</w:t>
+      </w:r>
+      <w:r>
+        <w:t xml:space="preserve"> </w:t>
+      </w:r>
+      <w:r>
+        <w:rPr>
+          <w:rStyle w:val="VerbatimChar"/>
+        </w:rPr>
+        <w:t xml:space="preserve">--hawkscan-required</w:t>
+      </w:r>
+      <w:r>
+        <w:t xml:space="preserve"> </w:t>
+      </w:r>
+      <w:r>
+        <w:t xml:space="preserve">flag.</w:t>
+      </w:r>
+    </w:p>
+    <w:p>
+      <w:pPr>
+        <w:pStyle w:val="BodyText"/>
+      </w:pPr>
+      <w:r>
+        <w:rPr>
+          <w:b/>
+          <w:bCs/>
+        </w:rPr>
         <w:t xml:space="preserve">§12.12 — Process/thread-limit (RLIMIT_NPROC) awareness for parallel subagent/multi-process work (User mandate, 2026-07-07).</w:t>
       </w:r>
       <w:r>
@@ -43479,6 +43750,1661 @@
       </w:r>
       <w:r>
         <w:t xml:space="preserve">flag.</w:t>
+      </w:r>
+    </w:p>
+    <w:p>
+      <w:pPr>
+        <w:pStyle w:val="BodyText"/>
+      </w:pPr>
+      <w:r>
+        <w:rPr>
+          <w:b/>
+          <w:bCs/>
+        </w:rPr>
+        <w:t xml:space="preserve">§11.4.272 — Dynamic, on-demand skill/extension activation (User mandate, 2026-09-07).</w:t>
+      </w:r>
+      <w:r>
+        <w:t xml:space="preserve"> </w:t>
+      </w:r>
+      <w:r>
+        <w:t xml:space="preserve">Cascade reference (short form): the ACTIVE capability surface (Agent Skills, plugins, extensions, tool sets) MUST be the MINIMUM genuinely needed at that moment, with everything else inactive by default and activatable ON DEMAND — a static all-on set is paid for in every turn of every session (measured 2026-09-07, Claude Code 2.1.263: a 955-skill pool renders as 29,153 B / ~7,288 tok of NAMES per turn, or 101,279 B / ~25,319 tok with descriptions — a 3.5x render-mode cliff the project does not control; byte counts exact, token conversion a labelled bytes/4 estimate). ALL hold: (A) a deliberately small declared</w:t>
+      </w:r>
+      <w:r>
+        <w:t xml:space="preserve"> </w:t>
+      </w:r>
+      <w:r>
+        <w:rPr>
+          <w:rStyle w:val="VerbatimChar"/>
+        </w:rPr>
+        <w:t xml:space="preserve">core</w:t>
+      </w:r>
+      <w:r>
+        <w:t xml:space="preserve">, everything else on demand, the manifest supplied as consumer DATA (§11.4.35); (B) DISCOVERABILITY IS NEVER TRADED FOR TOKENS — a deactivated capability stays findable via an always-available index and §11.4.102(B) still binds unconditionally; (C) FAIL SAFE NEVER SILENT (§11.4.201) — a failed activation says so explicitly, exits non-zero, and leaves nothing dangling, so the agent never believes it holds a tool it does not; (D) CONCURRENCY-SAFE reference counting (§11.4.119/§11.4.176/§11.4.180/§11.4.174) so one session never strips a capability another live session is using; (E) HONEST ASYMMETRY — built on PROVEN platform behaviour, not documented behaviour (measured: activation hot-loads mid-session, deactivation does NOT hot-unload; and</w:t>
+      </w:r>
+      <w:r>
+        <w:t xml:space="preserve"> </w:t>
+      </w:r>
+      <w:r>
+        <w:rPr>
+          <w:rStyle w:val="VerbatimChar"/>
+        </w:rPr>
+        <w:t xml:space="preserve">permissions.deny</w:t>
+      </w:r>
+      <w:r>
+        <w:t xml:space="preserve"> </w:t>
+      </w:r>
+      <w:r>
+        <w:rPr>
+          <w:rStyle w:val="VerbatimChar"/>
+        </w:rPr>
+        <w:t xml:space="preserve">Skill(name)</w:t>
+      </w:r>
+      <w:r>
+        <w:t xml:space="preserve"> </w:t>
+      </w:r>
+      <w:r>
+        <w:t xml:space="preserve">blocks invocation WITHOUT removing the rendered entry, saving zero tokens — a first-party mechanism must be TESTED for the property relied on, never assumed, so §11.4.74 is satisfied by evidence); (F) a BUDGET GATE bounds the active surface in BOTH render modes so an upstream switch to description-eager rendering breaks LOUDLY; (G) BOTH MODES — the engine lives in the constitution submodule (§11.4.28/§11.4.80/§11.4.177, by reference never copied) yet a project WITHOUT the submodule still gets a working command or an HONEST LOUD refusal with a distinct exit code naming what is unavailable, why, where it looked and what still works — never a silent no-op (REQ-NOTE-0001); (H) PRUNE-TO-CORE IS THE DEFAULT and is NOT a §11.4.122 removal (operator decision 2026-09-07) — session-init DEMOTES every non-core capability rather than merely raising</w:t>
+      </w:r>
+      <w:r>
+        <w:t xml:space="preserve"> </w:t>
+      </w:r>
+      <w:r>
+        <w:rPr>
+          <w:rStyle w:val="VerbatimChar"/>
+        </w:rPr>
+        <w:t xml:space="preserve">core</w:t>
+      </w:r>
+      <w:r>
+        <w:t xml:space="preserve"> </w:t>
+      </w:r>
+      <w:r>
+        <w:t xml:space="preserve">(raise-only satisfies (A) in letter and voids it in substance: the surface grows monotonically as capabilities accumulate; measured on the reference project 19 active / 422 B / ~105 tok-per-turn raise-only vs 3 active / 65 B / ~16 tok-per-turn prune-by-default), and it is NOT the silent removal §11.4.122 forbids because all three reversibility properties hold BY CONSTRUCTION — LISTED (the always-core catalogue of (B) still shows every pruned capability), ACTIVATABLE (one command returns it, hot-loading per (E)), NOT DELETED (a link-style activation loses only the LINK with its target untouched, and a sole-copy capability is MOVED to a preserved store that is itself a searched source — zero bytes destroyed), so a pruned capability is dormant and one command away, materially unlike dropping a component from a build; an unsafe demotion — another live session's claim per (D), a name collision in the preserved store (never clobber preserved content, §9.2), a move that fails or lands unreadable (it is REVERTED), or a capability that would not be re-activatable afterwards — MUST refuse LOUDLY and leave it ACTIVE per (C); relocation MUST be relocation-SAFE (path-relative references inside a capability re-pointed at the identical resolved target before the move, the post-move readability check the backstop that refuses and reverts); an EXPLICIT, DOCUMENTED opt-out MUST exist at session scope (an environment override) and project scope (a manifest flag), session scope winning, because a mechanism with no way out gets worked around destructively; and where the engine is unreachable pruning inherits (G)'s honest refusal — a session is NEVER left silently holding fewer capabilities than it believes it has. Honest boundary (§11.4.6): this reduces the cost of the capability LIST, not of a skill BODY once invoked, is never a licence to hide a capability the task needed, and clause (H) inherits (E)'s measured asymmetry — the saving lands at the next session start for anything the platform already cached, so prune runs AT session initialisation and its in-session effect is never overclaimed. Propagation gate</w:t>
+      </w:r>
+      <w:r>
+        <w:t xml:space="preserve"> </w:t>
+      </w:r>
+      <w:r>
+        <w:rPr>
+          <w:rStyle w:val="VerbatimChar"/>
+        </w:rPr>
+        <w:t xml:space="preserve">CM-COVENANT-114-272-PROPAGATION</w:t>
+      </w:r>
+      <w:r>
+        <w:t xml:space="preserve"> </w:t>
+      </w:r>
+      <w:r>
+        <w:t xml:space="preserve">(literal</w:t>
+      </w:r>
+      <w:r>
+        <w:t xml:space="preserve"> </w:t>
+      </w:r>
+      <w:r>
+        <w:rPr>
+          <w:rStyle w:val="VerbatimChar"/>
+        </w:rPr>
+        <w:t xml:space="preserve">11.4.272</w:t>
+      </w:r>
+      <w:r>
+        <w:t xml:space="preserve">) + recommended gates</w:t>
+      </w:r>
+      <w:r>
+        <w:t xml:space="preserve"> </w:t>
+      </w:r>
+      <w:r>
+        <w:rPr>
+          <w:rStyle w:val="VerbatimChar"/>
+        </w:rPr>
+        <w:t xml:space="preserve">CM-SKILL-SURFACE-BUDGET</w:t>
+      </w:r>
+      <w:r>
+        <w:t xml:space="preserve"> </w:t>
+      </w:r>
+      <w:r>
+        <w:t xml:space="preserve">/</w:t>
+      </w:r>
+      <w:r>
+        <w:t xml:space="preserve"> </w:t>
+      </w:r>
+      <w:r>
+        <w:rPr>
+          <w:rStyle w:val="VerbatimChar"/>
+        </w:rPr>
+        <w:t xml:space="preserve">CM-SKILL-ACTIVATION-FAIL-SAFE</w:t>
+      </w:r>
+      <w:r>
+        <w:t xml:space="preserve"> </w:t>
+      </w:r>
+      <w:r>
+        <w:t xml:space="preserve">/</w:t>
+      </w:r>
+      <w:r>
+        <w:t xml:space="preserve"> </w:t>
+      </w:r>
+      <w:r>
+        <w:rPr>
+          <w:rStyle w:val="VerbatimChar"/>
+        </w:rPr>
+        <w:t xml:space="preserve">CM-SKILL-PRUNE-PRESERVES-CONTENT</w:t>
+      </w:r>
+      <w:r>
+        <w:t xml:space="preserve"> </w:t>
+      </w:r>
+      <w:r>
+        <w:t xml:space="preserve">(after a prune every demoted capability is still LISTED, still ACTIVATABLE, and its content byte-identical to its pre-prune state; an unsafe demotion refuses and leaves the capability ACTIVE) + paired §1.1 mutation (make the demotion DESTRUCTIVE, or strip the relocation-safety step, or strip the other-live-session claim check → the prune gate MUST FAIL).</w:t>
+      </w:r>
+      <w:r>
+        <w:t xml:space="preserve"> </w:t>
+      </w:r>
+      <w:r>
+        <w:rPr>
+          <w:b/>
+          <w:bCs/>
+        </w:rPr>
+        <w:t xml:space="preserve">Canonical authority:</w:t>
+      </w:r>
+      <w:r>
+        <w:t xml:space="preserve"> </w:t>
+      </w:r>
+      <w:r>
+        <w:t xml:space="preserve">constitution submodule</w:t>
+      </w:r>
+      <w:r>
+        <w:t xml:space="preserve"> </w:t>
+      </w:r>
+      <w:hyperlink r:id="rId12">
+        <w:r>
+          <w:rPr>
+            <w:rStyle w:val="VerbatimChar"/>
+          </w:rPr>
+          <w:t xml:space="preserve">Constitution.md</w:t>
+        </w:r>
+      </w:hyperlink>
+      <w:r>
+        <w:t xml:space="preserve"> </w:t>
+      </w:r>
+      <w:r>
+        <w:t xml:space="preserve">§11.4.272 — the full mandate text is canonical there and is inherited by reference (CONST-059 / §11.4.35). Non-compliance is a release blocker.</w:t>
+      </w:r>
+    </w:p>
+    <w:p>
+      <w:pPr>
+        <w:pStyle w:val="BodyText"/>
+      </w:pPr>
+      <w:r>
+        <w:rPr>
+          <w:b/>
+          <w:bCs/>
+        </w:rPr>
+        <w:t xml:space="preserve">§11.4.273 — Measuring-instrument verification: a census that INFORMS a decision must be control-needled before its result is believed (research-derived, 2026-09-08).</w:t>
+      </w:r>
+      <w:r>
+        <w:t xml:space="preserve"> </w:t>
+      </w:r>
+      <w:r>
+        <w:t xml:space="preserve">Forensic anchor: FIFTEEN instances in one session where an ad-hoc measurement returned a confident, plausible, actionable result that was an artefact of the instrument, not a property of the system — a pattern matching only one of two block-opener forms (manufacturing 24 phantom findings);</w:t>
+      </w:r>
+      <w:r>
+        <w:t xml:space="preserve"> </w:t>
+      </w:r>
+      <w:r>
+        <w:rPr>
+          <w:rStyle w:val="VerbatimChar"/>
+        </w:rPr>
+        <w:t xml:space="preserve">comm</w:t>
+      </w:r>
+      <w:r>
+        <w:t xml:space="preserve"> </w:t>
+      </w:r>
+      <w:r>
+        <w:t xml:space="preserve">on numerically-sorted input reporting all 34 items missing;</w:t>
+      </w:r>
+      <w:r>
+        <w:t xml:space="preserve"> </w:t>
+      </w:r>
+      <w:r>
+        <w:rPr>
+          <w:rStyle w:val="VerbatimChar"/>
+        </w:rPr>
+        <w:t xml:space="preserve">$?</w:t>
+      </w:r>
+      <w:r>
+        <w:t xml:space="preserve"> </w:t>
+      </w:r>
+      <w:r>
+        <w:t xml:space="preserve">read after a pipeline turning exit 1 into 0; a field-name typo reading as "every record lost its key binding";</w:t>
+      </w:r>
+      <w:r>
+        <w:t xml:space="preserve"> </w:t>
+      </w:r>
+      <w:r>
+        <w:rPr>
+          <w:rStyle w:val="VerbatimChar"/>
+        </w:rPr>
+        <w:t xml:space="preserve">grep -w</w:t>
+      </w:r>
+      <w:r>
+        <w:t xml:space="preserve"> </w:t>
+      </w:r>
+      <w:r>
+        <w:t xml:space="preserve">matching</w:t>
+      </w:r>
+      <w:r>
+        <w:t xml:space="preserve"> </w:t>
+      </w:r>
+      <w:r>
+        <w:rPr>
+          <w:rStyle w:val="VerbatimChar"/>
+        </w:rPr>
+        <w:t xml:space="preserve">zai</w:t>
+      </w:r>
+      <w:r>
+        <w:t xml:space="preserve"> </w:t>
+      </w:r>
+      <w:r>
+        <w:t xml:space="preserve">inside</w:t>
+      </w:r>
+      <w:r>
+        <w:t xml:space="preserve"> </w:t>
+      </w:r>
+      <w:r>
+        <w:rPr>
+          <w:rStyle w:val="VerbatimChar"/>
+        </w:rPr>
+        <w:t xml:space="preserve">zai-coding-plan</w:t>
+      </w:r>
+      <w:r>
+        <w:t xml:space="preserve"> </w:t>
+      </w:r>
+      <w:r>
+        <w:t xml:space="preserve">and corrupting a classification; a summary grep assuming</w:t>
+      </w:r>
+      <w:r>
+        <w:t xml:space="preserve"> </w:t>
+      </w:r>
+      <w:r>
+        <w:rPr>
+          <w:rStyle w:val="VerbatimChar"/>
+        </w:rPr>
+        <w:t xml:space="preserve">passed, failed</w:t>
+      </w:r>
+      <w:r>
+        <w:t xml:space="preserve"> </w:t>
+      </w:r>
+      <w:r>
+        <w:t xml:space="preserve">when failure prints</w:t>
+      </w:r>
+      <w:r>
+        <w:t xml:space="preserve"> </w:t>
+      </w:r>
+      <w:r>
+        <w:rPr>
+          <w:rStyle w:val="VerbatimChar"/>
+        </w:rPr>
+        <w:t xml:space="preserve">failed, passed</w:t>
+      </w:r>
+      <w:r>
+        <w:t xml:space="preserve">;</w:t>
+      </w:r>
+      <w:r>
+        <w:t xml:space="preserve"> </w:t>
+      </w:r>
+      <w:r>
+        <w:rPr>
+          <w:rStyle w:val="VerbatimChar"/>
+        </w:rPr>
+        <w:t xml:space="preserve">while read</w:t>
+      </w:r>
+      <w:r>
+        <w:t xml:space="preserve"> </w:t>
+      </w:r>
+      <w:r>
+        <w:t xml:space="preserve">dropping an unterminated final line so a one-element list iterated zero times; a mutation applied with the wrong env knob so the REAL tree was tested and the green meant nothing; a guard probe using a command the guard does not target, proving nothing while reading as a negative; a fixture whose two columns held the same string, so a real column-swap mutation survived at 52/0 under a comment asserting that could not happen; a positive control chosen OUTSIDE the instrument's scope reporting a working instrument as broken, and another chosen to BE the question under test so it could not discriminate; an</w:t>
+      </w:r>
+      <w:r>
+        <w:t xml:space="preserve"> </w:t>
+      </w:r>
+      <w:r>
+        <w:rPr>
+          <w:rStyle w:val="VerbatimChar"/>
+        </w:rPr>
+        <w:t xml:space="preserve">awk</w:t>
+      </w:r>
+      <w:r>
+        <w:t xml:space="preserve"> </w:t>
+      </w:r>
+      <w:r>
+        <w:t xml:space="preserve">range whose escaping matched nothing reporting 838 rows where the system held 134, about to gate a DESTRUCTIVE recreate;</w:t>
+      </w:r>
+      <w:r>
+        <w:t xml:space="preserve"> </w:t>
+      </w:r>
+      <w:r>
+        <w:rPr>
+          <w:b/>
+          <w:bCs/>
+        </w:rPr>
+        <w:t xml:space="preserve">a two-literal denylist searched with ONE literal</w:t>
+      </w:r>
+      <w:r>
+        <w:t xml:space="preserve"> </w:t>
+      </w:r>
+      <w:r>
+        <w:t xml:space="preserve">— both loaded, both lengths printed, one searched — so a live credential was reported eliminated while still handed over in four copy-pasteable lines per file, with the positive control PASSING because it shared the same single needle; and</w:t>
+      </w:r>
+      <w:r>
+        <w:t xml:space="preserve"> </w:t>
+      </w:r>
+      <w:r>
+        <w:rPr>
+          <w:rStyle w:val="VerbatimChar"/>
+        </w:rPr>
+        <w:t xml:space="preserve">$?</w:t>
+      </w:r>
+      <w:r>
+        <w:t xml:space="preserve"> </w:t>
+      </w:r>
+      <w:r>
+        <w:t xml:space="preserve">clobbered by a command substitution in the same argument list, reporting a</w:t>
+      </w:r>
+      <w:r>
+        <w:t xml:space="preserve"> </w:t>
+      </w:r>
+      <w:r>
+        <w:rPr>
+          <w:rStyle w:val="VerbatimChar"/>
+        </w:rPr>
+        <w:t xml:space="preserve">pandoc</w:t>
+      </w:r>
+      <w:r>
+        <w:t xml:space="preserve"> </w:t>
+      </w:r>
+      <w:r>
+        <w:t xml:space="preserve">failure (exit 64) as exit 0.</w:t>
+      </w:r>
+      <w:r>
+        <w:t xml:space="preserve"> </w:t>
+      </w:r>
+      <w:r>
+        <w:rPr>
+          <w:b/>
+          <w:bCs/>
+        </w:rPr>
+        <w:t xml:space="preserve">The gap:</w:t>
+      </w:r>
+      <w:r>
+        <w:t xml:space="preserve"> </w:t>
+      </w:r>
+      <w:r>
+        <w:t xml:space="preserve">§11.4.201 governs guards/gates (instruments that BLOCK) and §11.4.107(10) governs analyzers (calibrated golden-good/bad); NEITHER covers the ad-hoc census that INFORMS — a grep, a set difference, an exit-code read, a field lookup — whose output is not a verdict but a FACT a decision is then built on, written inline, used once, trusted implicitly, never itself tested.</w:t>
+      </w:r>
+      <w:r>
+        <w:t xml:space="preserve"> </w:t>
+      </w:r>
+      <w:r>
+        <w:rPr>
+          <w:b/>
+          <w:bCs/>
+        </w:rPr>
+        <w:t xml:space="preserve">Mandate:</w:t>
+      </w:r>
+      <w:r>
+        <w:t xml:space="preserve"> </w:t>
+      </w:r>
+      <w:r>
+        <w:t xml:space="preserve">any measurement whose result will drive a decision, claim, classification or report MUST be control-needled BEFORE it is acted on —</w:t>
+      </w:r>
+      <w:r>
+        <w:t xml:space="preserve"> </w:t>
+      </w:r>
+      <w:r>
+        <w:rPr>
+          <w:b/>
+          <w:bCs/>
+        </w:rPr>
+        <w:t xml:space="preserve">(a)</w:t>
+      </w:r>
+      <w:r>
+        <w:t xml:space="preserve"> </w:t>
+      </w:r>
+      <w:r>
+        <w:t xml:space="preserve">a POSITIVE control (a value known present must be found: catches too-narrow patterns, wrong field names, wrong paths, wrong knobs, silently-empty stages);</w:t>
+      </w:r>
+      <w:r>
+        <w:t xml:space="preserve"> </w:t>
+      </w:r>
+      <w:r>
+        <w:rPr>
+          <w:b/>
+          <w:bCs/>
+        </w:rPr>
+        <w:t xml:space="preserve">(b)</w:t>
+      </w:r>
+      <w:r>
+        <w:t xml:space="preserve"> </w:t>
+      </w:r>
+      <w:r>
+        <w:t xml:space="preserve">a NEGATIVE control (a fabricated needle must NOT be found: catches too-broad patterns, accidental substring/word-boundary matches, fabricating defaults);</w:t>
+      </w:r>
+      <w:r>
+        <w:t xml:space="preserve"> </w:t>
+      </w:r>
+      <w:r>
+        <w:rPr>
+          <w:b/>
+          <w:bCs/>
+        </w:rPr>
+        <w:t xml:space="preserve">(c)</w:t>
+      </w:r>
+      <w:r>
+        <w:t xml:space="preserve"> </w:t>
+      </w:r>
+      <w:r>
+        <w:t xml:space="preserve">an EMPTY result is NEVER a finding alone — absent, could-not-look, looked-in-the-wrong-place and output-shape-differed are four distinct states the raw empty distinguishes between none of (§11.4.6);</w:t>
+      </w:r>
+      <w:r>
+        <w:t xml:space="preserve"> </w:t>
+      </w:r>
+      <w:r>
+        <w:rPr>
+          <w:b/>
+          <w:bCs/>
+        </w:rPr>
+        <w:t xml:space="preserve">(d)</w:t>
+      </w:r>
+      <w:r>
+        <w:t xml:space="preserve"> </w:t>
+      </w:r>
+      <w:r>
+        <w:t xml:space="preserve">a result CONTRADICTING directly-observed evidence is presumed an instrument fault until proven otherwise;</w:t>
+      </w:r>
+      <w:r>
+        <w:t xml:space="preserve"> </w:t>
+      </w:r>
+      <w:r>
+        <w:rPr>
+          <w:b/>
+          <w:bCs/>
+        </w:rPr>
+        <w:t xml:space="preserve">(e)</w:t>
+      </w:r>
+      <w:r>
+        <w:t xml:space="preserve"> </w:t>
+      </w:r>
+      <w:r>
+        <w:t xml:space="preserve">the instrument is part of the evidence — a captured claim cites the command that produced it (§11.4.5/§11.4.2);</w:t>
+      </w:r>
+      <w:r>
+        <w:t xml:space="preserve"> </w:t>
+      </w:r>
+      <w:r>
+        <w:rPr>
+          <w:b/>
+          <w:bCs/>
+        </w:rPr>
+        <w:t xml:space="preserve">(f)</w:t>
+      </w:r>
+      <w:r>
+        <w:t xml:space="preserve"> </w:t>
+      </w:r>
+      <w:r>
+        <w:t xml:space="preserve">when the criterion is a SET, the control must cover EVERY member — needling ONE member proves only that member is searchable, and (a) and (b) both PASS while the answer is wrong if the search and its control share the same single needle (measured: a two-literal denylist searched with one literal reported a live credential eliminated while it was still handed over in four copy-pasteable lines per file);</w:t>
+      </w:r>
+      <w:r>
+        <w:t xml:space="preserve"> </w:t>
+      </w:r>
+      <w:r>
+        <w:rPr>
+          <w:b/>
+          <w:bCs/>
+        </w:rPr>
+        <w:t xml:space="preserve">(g)</w:t>
+      </w:r>
+      <w:r>
+        <w:t xml:space="preserve"> </w:t>
+      </w:r>
+      <w:r>
+        <w:t xml:space="preserve">capture an exit status BEFORE any other expansion can overwrite it —</w:t>
+      </w:r>
+      <w:r>
+        <w:t xml:space="preserve"> </w:t>
+      </w:r>
+      <w:r>
+        <w:rPr>
+          <w:rStyle w:val="VerbatimChar"/>
+        </w:rPr>
+        <w:t xml:space="preserve">$?</w:t>
+      </w:r>
+      <w:r>
+        <w:t xml:space="preserve"> </w:t>
+      </w:r>
+      <w:r>
+        <w:t xml:space="preserve">is the LAST command's status, which in a compound statement is often not the one being reported on, whether a pipeline's last stage or a command substitution earlier in the same argument list.</w:t>
+      </w:r>
+      <w:r>
+        <w:t xml:space="preserve"> </w:t>
+      </w:r>
+      <w:r>
+        <w:rPr>
+          <w:b/>
+          <w:bCs/>
+        </w:rPr>
+        <w:t xml:space="preserve">Honest boundary (§11.4.6):</w:t>
+      </w:r>
+      <w:r>
+        <w:t xml:space="preserve"> </w:t>
+      </w:r>
+      <w:r>
+        <w:t xml:space="preserve">control needles prove an instrument can tell PRESENT from ABSENT; they do NOT prove it measures the RIGHT property, and a correctly-needled census of the wrong thing is still the wrong answer. Classification: universal (§11.4.17). Composes §11.4.5/.6/.2/.107(10)/.118/.201/§1.1. Propagation gate</w:t>
+      </w:r>
+      <w:r>
+        <w:t xml:space="preserve"> </w:t>
+      </w:r>
+      <w:r>
+        <w:rPr>
+          <w:rStyle w:val="VerbatimChar"/>
+        </w:rPr>
+        <w:t xml:space="preserve">CM-COVENANT-114-273-PROPAGATION</w:t>
+      </w:r>
+      <w:r>
+        <w:t xml:space="preserve"> </w:t>
+      </w:r>
+      <w:r>
+        <w:t xml:space="preserve">(literal</w:t>
+      </w:r>
+      <w:r>
+        <w:t xml:space="preserve"> </w:t>
+      </w:r>
+      <w:r>
+        <w:rPr>
+          <w:rStyle w:val="VerbatimChar"/>
+        </w:rPr>
+        <w:t xml:space="preserve">11.4.273</w:t>
+      </w:r>
+      <w:r>
+        <w:t xml:space="preserve">) + recommended gate</w:t>
+      </w:r>
+      <w:r>
+        <w:t xml:space="preserve"> </w:t>
+      </w:r>
+      <w:r>
+        <w:rPr>
+          <w:rStyle w:val="VerbatimChar"/>
+        </w:rPr>
+        <w:t xml:space="preserve">CM-CENSUS-CONTROL-NEEDLED</w:t>
+      </w:r>
+      <w:r>
+        <w:t xml:space="preserve"> </w:t>
+      </w:r>
+      <w:r>
+        <w:t xml:space="preserve">+ paired §1.1 mutation (gate-code = separate work item, NOT claimed shipped).</w:t>
+      </w:r>
+      <w:r>
+        <w:t xml:space="preserve"> </w:t>
+      </w:r>
+      <w:r>
+        <w:rPr>
+          <w:b/>
+          <w:bCs/>
+        </w:rPr>
+        <w:t xml:space="preserve">Canonical authority:</w:t>
+      </w:r>
+      <w:r>
+        <w:t xml:space="preserve"> </w:t>
+      </w:r>
+      <w:r>
+        <w:t xml:space="preserve">constitution submodule</w:t>
+      </w:r>
+      <w:r>
+        <w:t xml:space="preserve"> </w:t>
+      </w:r>
+      <w:hyperlink r:id="rId12">
+        <w:r>
+          <w:rPr>
+            <w:rStyle w:val="VerbatimChar"/>
+          </w:rPr>
+          <w:t xml:space="preserve">Constitution.md</w:t>
+        </w:r>
+      </w:hyperlink>
+      <w:r>
+        <w:t xml:space="preserve"> </w:t>
+      </w:r>
+      <w:r>
+        <w:t xml:space="preserve">§11.4.273. Non-compliance is a release blocker. No escape hatch — no</w:t>
+      </w:r>
+      <w:r>
+        <w:t xml:space="preserve"> </w:t>
+      </w:r>
+      <w:r>
+        <w:rPr>
+          <w:rStyle w:val="VerbatimChar"/>
+        </w:rPr>
+        <w:t xml:space="preserve">--skip-control-needle</w:t>
+      </w:r>
+      <w:r>
+        <w:t xml:space="preserve">,</w:t>
+      </w:r>
+      <w:r>
+        <w:t xml:space="preserve"> </w:t>
+      </w:r>
+      <w:r>
+        <w:rPr>
+          <w:rStyle w:val="VerbatimChar"/>
+        </w:rPr>
+        <w:t xml:space="preserve">--empty-is-absent</w:t>
+      </w:r>
+      <w:r>
+        <w:t xml:space="preserve">,</w:t>
+      </w:r>
+      <w:r>
+        <w:t xml:space="preserve"> </w:t>
+      </w:r>
+      <w:r>
+        <w:rPr>
+          <w:rStyle w:val="VerbatimChar"/>
+        </w:rPr>
+        <w:t xml:space="preserve">--trust-the-grep</w:t>
+      </w:r>
+      <w:r>
+        <w:t xml:space="preserve">,</w:t>
+      </w:r>
+      <w:r>
+        <w:t xml:space="preserve"> </w:t>
+      </w:r>
+      <w:r>
+        <w:rPr>
+          <w:rStyle w:val="VerbatimChar"/>
+        </w:rPr>
+        <w:t xml:space="preserve">--census-needs-no-proof</w:t>
+      </w:r>
+      <w:r>
+        <w:t xml:space="preserve">,</w:t>
+      </w:r>
+      <w:r>
+        <w:t xml:space="preserve"> </w:t>
+      </w:r>
+      <w:r>
+        <w:rPr>
+          <w:rStyle w:val="VerbatimChar"/>
+        </w:rPr>
+        <w:t xml:space="preserve">--obvious-result-exempt</w:t>
+      </w:r>
+      <w:r>
+        <w:t xml:space="preserve"> </w:t>
+      </w:r>
+      <w:r>
+        <w:t xml:space="preserve">flag.</w:t>
+      </w:r>
+    </w:p>
+    <w:p>
+      <w:pPr>
+        <w:pStyle w:val="BodyText"/>
+      </w:pPr>
+      <w:r>
+        <w:rPr>
+          <w:b/>
+          <w:bCs/>
+        </w:rPr>
+        <w:t xml:space="preserve">§11.4.274 — Mechanical work belongs in a script, not in an agent's context: extract it, test it, and re-scan for it on a cadence (User mandate, 2026-09-08).</w:t>
+      </w:r>
+      <w:r>
+        <w:t xml:space="preserve"> </w:t>
+      </w:r>
+      <w:r>
+        <w:t xml:space="preserve">Forensic anchor: in one session five review agents consumed ~400–450k tokens EACH, and the dominant cost was not judgment but MECHANICS — copy a tree to scratch, apply a one-line mutation, run a suite, read the summary, restore, verify byte-identical, compare against the previous round, repeat seven times. Every step is deterministic, fixed-input/fixed-output, decision-free: a shell script, executed instead one tool call at a time by a language model at orders of magnitude the cost, with a fresh chance of transcription error at each step (this session logged ten such instrument errors, §11.4.273).</w:t>
+      </w:r>
+      <w:r>
+        <w:t xml:space="preserve"> </w:t>
+      </w:r>
+      <w:r>
+        <w:rPr>
+          <w:b/>
+          <w:bCs/>
+        </w:rPr>
+        <w:t xml:space="preserve">Rule:</w:t>
+      </w:r>
+      <w:r>
+        <w:t xml:space="preserve"> </w:t>
+      </w:r>
+      <w:r>
+        <w:t xml:space="preserve">work that is DETERMINISTIC, REPEATABLE and contains NO JUDGMENT MUST be delegated to a properly written script or small compiled utility and invoked, not performed turn-by-turn — mutation apply/run/restore/verify loops, suite fan-outs and result tabulation, before/after comparisons, scratch setup and teardown, residue and quiescence scans, census and inventory queries, artifact fingerprinting, evidence collection and layout, and any step already written down as a fixed recipe.</w:t>
+      </w:r>
+      <w:r>
+        <w:t xml:space="preserve"> </w:t>
+      </w:r>
+      <w:r>
+        <w:rPr>
+          <w:b/>
+          <w:bCs/>
+        </w:rPr>
+        <w:t xml:space="preserve">(a) EXTRACT:</w:t>
+      </w:r>
+      <w:r>
+        <w:t xml:space="preserve"> </w:t>
+      </w:r>
+      <w:r>
+        <w:t xml:space="preserve">a mechanical sequence an agent performs more than twice is a defect in the tooling, not a task — name it, script it, invoke it.</w:t>
+      </w:r>
+      <w:r>
+        <w:t xml:space="preserve"> </w:t>
+      </w:r>
+      <w:r>
+        <w:rPr>
+          <w:b/>
+          <w:bCs/>
+        </w:rPr>
+        <w:t xml:space="preserve">(b) THE TOOL IS GOVERNED:</w:t>
+      </w:r>
+      <w:r>
+        <w:t xml:space="preserve"> </w:t>
+      </w:r>
+      <w:r>
+        <w:t xml:space="preserve">it ships with actionable documentation (§11.4.18), a user guide/manual entry where operator-facing, and tests validating its behaviour AND producing machine evidence deterministically (§11.4.50/§11.4.5) — including failure paths, exit-code semantics (§11.4.201) and the control needles proving its own measurements (§11.4.273); replacing a slow correct process with a fast unproven one is a regression, not an optimisation.</w:t>
+      </w:r>
+      <w:r>
+        <w:t xml:space="preserve"> </w:t>
+      </w:r>
+      <w:r>
+        <w:rPr>
+          <w:b/>
+          <w:bCs/>
+        </w:rPr>
+        <w:t xml:space="preserve">(c) RE-SCAN ON A CADENCE:</w:t>
+      </w:r>
+      <w:r>
+        <w:t xml:space="preserve"> </w:t>
+      </w:r>
+      <w:r>
+        <w:t xml:space="preserve">every project periodically scans itself for mechanical work still done by agents (recurring command sequences in transcripts/logs, repeated inline recipes, "run these commands in order" docs) and refactors the findings out — a standing obligation, since new mechanical loops accrete continuously.</w:t>
+      </w:r>
+      <w:r>
+        <w:t xml:space="preserve"> </w:t>
+      </w:r>
+      <w:r>
+        <w:rPr>
+          <w:b/>
+          <w:bCs/>
+        </w:rPr>
+        <w:t xml:space="preserve">(d) HONEST BOUNDARY (§11.4.6) — what MUST NOT be extracted:</w:t>
+      </w:r>
+      <w:r>
+        <w:t xml:space="preserve"> </w:t>
+      </w:r>
+      <w:r>
+        <w:t xml:space="preserve">JUDGMENT. Root-cause determination (§11.4.102), review verdicts (§11.4.125/§11.4.142/§11.4.194), the decision that a fix is correct, the choice of what to measure, the reading of whether evidence supports a claim, and any assessment requiring "is this the right thing to check?" A script that renders a verdict is a bluff gate (§11.4.201), and automating a review into a green checkmark is the exact PASS-bluff this constitution exists to prevent. The division is: the SCRIPT gathers and executes deterministically and cheaply; the AGENT decides what it means. Cost is NEVER a reason to move a decision into a script. Classification: universal (§11.4.17). Composes §11.4.18/.50/.5/.141/.201/.273/.124/§1.1. Propagation gate</w:t>
+      </w:r>
+      <w:r>
+        <w:t xml:space="preserve"> </w:t>
+      </w:r>
+      <w:r>
+        <w:rPr>
+          <w:rStyle w:val="VerbatimChar"/>
+        </w:rPr>
+        <w:t xml:space="preserve">CM-COVENANT-114-274-PROPAGATION</w:t>
+      </w:r>
+      <w:r>
+        <w:t xml:space="preserve"> </w:t>
+      </w:r>
+      <w:r>
+        <w:t xml:space="preserve">(literal</w:t>
+      </w:r>
+      <w:r>
+        <w:t xml:space="preserve"> </w:t>
+      </w:r>
+      <w:r>
+        <w:rPr>
+          <w:rStyle w:val="VerbatimChar"/>
+        </w:rPr>
+        <w:t xml:space="preserve">11.4.274</w:t>
+      </w:r>
+      <w:r>
+        <w:t xml:space="preserve">) + recommended gates</w:t>
+      </w:r>
+      <w:r>
+        <w:t xml:space="preserve"> </w:t>
+      </w:r>
+      <w:r>
+        <w:rPr>
+          <w:rStyle w:val="VerbatimChar"/>
+        </w:rPr>
+        <w:t xml:space="preserve">CM-MECHANICAL-WORK-EXTRACTED</w:t>
+      </w:r>
+      <w:r>
+        <w:t xml:space="preserve"> </w:t>
+      </w:r>
+      <w:r>
+        <w:t xml:space="preserve">/</w:t>
+      </w:r>
+      <w:r>
+        <w:t xml:space="preserve"> </w:t>
+      </w:r>
+      <w:r>
+        <w:rPr>
+          <w:rStyle w:val="VerbatimChar"/>
+        </w:rPr>
+        <w:t xml:space="preserve">CM-EXTRACTED-TOOL-DOCUMENTED-AND-TESTED</w:t>
+      </w:r>
+      <w:r>
+        <w:t xml:space="preserve"> </w:t>
+      </w:r>
+      <w:r>
+        <w:t xml:space="preserve">+ paired §1.1 mutation (gate-code = separate work item, NOT claimed shipped).</w:t>
+      </w:r>
+      <w:r>
+        <w:t xml:space="preserve"> </w:t>
+      </w:r>
+      <w:r>
+        <w:rPr>
+          <w:b/>
+          <w:bCs/>
+        </w:rPr>
+        <w:t xml:space="preserve">Canonical authority:</w:t>
+      </w:r>
+      <w:r>
+        <w:t xml:space="preserve"> </w:t>
+      </w:r>
+      <w:r>
+        <w:t xml:space="preserve">constitution submodule</w:t>
+      </w:r>
+      <w:r>
+        <w:t xml:space="preserve"> </w:t>
+      </w:r>
+      <w:hyperlink r:id="rId12">
+        <w:r>
+          <w:rPr>
+            <w:rStyle w:val="VerbatimChar"/>
+          </w:rPr>
+          <w:t xml:space="preserve">Constitution.md</w:t>
+        </w:r>
+      </w:hyperlink>
+      <w:r>
+        <w:t xml:space="preserve"> </w:t>
+      </w:r>
+      <w:r>
+        <w:t xml:space="preserve">§11.4.274. Non-compliance is a release blocker. No escape hatch — no</w:t>
+      </w:r>
+      <w:r>
+        <w:t xml:space="preserve"> </w:t>
+      </w:r>
+      <w:r>
+        <w:rPr>
+          <w:rStyle w:val="VerbatimChar"/>
+        </w:rPr>
+        <w:t xml:space="preserve">--skip-extraction</w:t>
+      </w:r>
+      <w:r>
+        <w:t xml:space="preserve">,</w:t>
+      </w:r>
+      <w:r>
+        <w:t xml:space="preserve"> </w:t>
+      </w:r>
+      <w:r>
+        <w:rPr>
+          <w:rStyle w:val="VerbatimChar"/>
+        </w:rPr>
+        <w:t xml:space="preserve">--agent-can-do-it</w:t>
+      </w:r>
+      <w:r>
+        <w:t xml:space="preserve">,</w:t>
+      </w:r>
+      <w:r>
+        <w:t xml:space="preserve"> </w:t>
+      </w:r>
+      <w:r>
+        <w:rPr>
+          <w:rStyle w:val="VerbatimChar"/>
+        </w:rPr>
+        <w:t xml:space="preserve">--one-off-is-fine</w:t>
+      </w:r>
+      <w:r>
+        <w:t xml:space="preserve">,</w:t>
+      </w:r>
+      <w:r>
+        <w:t xml:space="preserve"> </w:t>
+      </w:r>
+      <w:r>
+        <w:rPr>
+          <w:rStyle w:val="VerbatimChar"/>
+        </w:rPr>
+        <w:t xml:space="preserve">--script-the-review</w:t>
+      </w:r>
+      <w:r>
+        <w:t xml:space="preserve">,</w:t>
+      </w:r>
+      <w:r>
+        <w:t xml:space="preserve"> </w:t>
+      </w:r>
+      <w:r>
+        <w:rPr>
+          <w:rStyle w:val="VerbatimChar"/>
+        </w:rPr>
+        <w:t xml:space="preserve">--extract-without-tests</w:t>
+      </w:r>
+      <w:r>
+        <w:t xml:space="preserve"> </w:t>
+      </w:r>
+      <w:r>
+        <w:t xml:space="preserve">flag.</w:t>
+      </w:r>
+    </w:p>
+    <w:p>
+      <w:pPr>
+        <w:pStyle w:val="BodyText"/>
+      </w:pPr>
+      <w:r>
+        <w:rPr>
+          <w:b/>
+          <w:bCs/>
+        </w:rPr>
+        <w:t xml:space="preserve">§11.4.275 — Semantic (Lumen) index + indexing-efficiency gate + universal agent/subagent accessibility (research-derived, 2026-09-24).</w:t>
+      </w:r>
+      <w:r>
+        <w:t xml:space="preserve"> </w:t>
+      </w:r>
+      <w:r>
+        <w:t xml:space="preserve">Compact summary: every code index the project maintains — the structural CodeGraph index (§11.4.78) AND the semantic Lumen index, and any future code index — MUST (A) be reachable by EVERY agent AND every dispatched subagent through a server definition they can actually resolve (committed project config or installed plugin); a config that ENABLES a server nothing DECLARES is a violation; proof = a real tool call from a dispatched subagent returning an index-only fact (§11.4.78(4) unforgeable challenge), un-drivable agents = documented §11.4.3 SKIP; (B) for the semantic index: embedding model provisioned rootless (§11.4.161) and proven by a real embed call returning the declared dimensions, scope GENERATED from the same class source as the structural scope (</w:t>
+      </w:r>
+      <w:r>
+        <w:rPr>
+          <w:rStyle w:val="VerbatimChar"/>
+        </w:rPr>
+        <w:t xml:space="preserve">&lt;constitution&gt;/scripts/lumen/gen_lumenignore.py</w:t>
+      </w:r>
+      <w:r>
+        <w:t xml:space="preserve">), health = files AND chunks non-zero + known-symbol hit + negative control + freshness within consumer TTL; (C) be called ready ONLY when pending work == 0, state complete, file count within consumer tolerance of the accepted count, schema indexes present — every count/empty result control-needled (§11.4.273); (D) earn its place by a DETERMINISTIC benchmark (fixed queries + golden answers, index route vs grep+read, N≥3 identical canonical hashes per §11.4.50, bytes/est-tokens/p50/p95/correctness per query), reduction computed ONLY over queries both routes answered correctly, wrong answers listed BY ID and never averaged away, thresholds = consumer DATA (§11.4.35); (E) route structural→CodeGraph, conceptual→Lumen before grep+read (§11.4.141) except measured-wrong query classes (fall back + tracked); (F) root-cause + patch performance defects in the version-keyed runner with RED→GREEN + paired mutation + byte-copy equivalence proof; (G) writes via the single writer entry (§11.4.80(5)), live reads read-only. Forensic FACTS (genericised): a configured semantic server reported 0 files / no model / never indexed; the structural index cut tokens 69.2% over 8 both-correct fixture queries yet answered 5 of 15 fixture queries WRONG (grep+read 2 of 15); one uncached full-table file-list query was 93.4% of resolve time; an FK-cascade stalled the bulk window; a launcher classifying</w:t>
+      </w:r>
+      <w:r>
+        <w:t xml:space="preserve"> </w:t>
+      </w:r>
+      <w:r>
+        <w:rPr>
+          <w:rStyle w:val="VerbatimChar"/>
+        </w:rPr>
+        <w:t xml:space="preserve">sync</w:t>
+      </w:r>
+      <w:r>
+        <w:t xml:space="preserve"> </w:t>
+      </w:r>
+      <w:r>
+        <w:t xml:space="preserve">by stored rows instead of pending backlog ran a tens-of-millions-reference bulk job stock + foreground + unsupervised; the vendor reaps locks by age not liveness and a writable open recreates dropped indexes without the lock; an errored instrument's empty result was nearly read as absence. Latent binding (§11.4.96 pattern): a project with no semantic index is bound only for the indexes it maintains; the semantic clauses bind the moment it adds one. Honest boundary (§11.4.6): proves reachable/complete/scoped/measured, not every answer correct; never licenses narrowing scope to hit a threshold (§11.4.66); the reference benchmark harness is still a prototype outside the constitution tree (landing = owed work). Classification: universal (§11.4.17). Propagation gate</w:t>
+      </w:r>
+      <w:r>
+        <w:t xml:space="preserve"> </w:t>
+      </w:r>
+      <w:r>
+        <w:rPr>
+          <w:rStyle w:val="VerbatimChar"/>
+        </w:rPr>
+        <w:t xml:space="preserve">CM-COVENANT-114-275-PROPAGATION</w:t>
+      </w:r>
+      <w:r>
+        <w:t xml:space="preserve"> </w:t>
+      </w:r>
+      <w:r>
+        <w:t xml:space="preserve">(literal</w:t>
+      </w:r>
+      <w:r>
+        <w:t xml:space="preserve"> </w:t>
+      </w:r>
+      <w:r>
+        <w:rPr>
+          <w:rStyle w:val="VerbatimChar"/>
+        </w:rPr>
+        <w:t xml:space="preserve">11.4.275</w:t>
+      </w:r>
+      <w:r>
+        <w:t xml:space="preserve">) + recommended gates</w:t>
+      </w:r>
+      <w:r>
+        <w:t xml:space="preserve"> </w:t>
+      </w:r>
+      <w:r>
+        <w:rPr>
+          <w:rStyle w:val="VerbatimChar"/>
+        </w:rPr>
+        <w:t xml:space="preserve">CM-CODE-INDEX-AGENT-ACCESSIBLE</w:t>
+      </w:r>
+      <w:r>
+        <w:t xml:space="preserve"> </w:t>
+      </w:r>
+      <w:r>
+        <w:t xml:space="preserve">/</w:t>
+      </w:r>
+      <w:r>
+        <w:t xml:space="preserve"> </w:t>
+      </w:r>
+      <w:r>
+        <w:rPr>
+          <w:rStyle w:val="VerbatimChar"/>
+        </w:rPr>
+        <w:t xml:space="preserve">CM-CODE-INDEX-COMPLETE-BEFORE-READY</w:t>
+      </w:r>
+      <w:r>
+        <w:t xml:space="preserve"> </w:t>
+      </w:r>
+      <w:r>
+        <w:t xml:space="preserve">/</w:t>
+      </w:r>
+      <w:r>
+        <w:t xml:space="preserve"> </w:t>
+      </w:r>
+      <w:r>
+        <w:rPr>
+          <w:rStyle w:val="VerbatimChar"/>
+        </w:rPr>
+        <w:t xml:space="preserve">CM-LUMEN-MODEL-PROVEN</w:t>
+      </w:r>
+      <w:r>
+        <w:t xml:space="preserve"> </w:t>
+      </w:r>
+      <w:r>
+        <w:t xml:space="preserve">/</w:t>
+      </w:r>
+      <w:r>
+        <w:t xml:space="preserve"> </w:t>
+      </w:r>
+      <w:r>
+        <w:rPr>
+          <w:rStyle w:val="VerbatimChar"/>
+        </w:rPr>
+        <w:t xml:space="preserve">CM-LUMEN-SCOPED-FRESH</w:t>
+      </w:r>
+      <w:r>
+        <w:t xml:space="preserve"> </w:t>
+      </w:r>
+      <w:r>
+        <w:t xml:space="preserve">/</w:t>
+      </w:r>
+      <w:r>
+        <w:t xml:space="preserve"> </w:t>
+      </w:r>
+      <w:r>
+        <w:rPr>
+          <w:rStyle w:val="VerbatimChar"/>
+        </w:rPr>
+        <w:t xml:space="preserve">CM-CODE-INDEX-BENCH</w:t>
+      </w:r>
+      <w:r>
+        <w:t xml:space="preserve"> </w:t>
+      </w:r>
+      <w:r>
+        <w:t xml:space="preserve">/</w:t>
+      </w:r>
+      <w:r>
+        <w:t xml:space="preserve"> </w:t>
+      </w:r>
+      <w:r>
+        <w:rPr>
+          <w:rStyle w:val="VerbatimChar"/>
+        </w:rPr>
+        <w:t xml:space="preserve">CM-CODEGRAPH-SCOPE-PROOF</w:t>
+      </w:r>
+      <w:r>
+        <w:t xml:space="preserve"> </w:t>
+      </w:r>
+      <w:r>
+        <w:t xml:space="preserve">/</w:t>
+      </w:r>
+      <w:r>
+        <w:t xml:space="preserve"> </w:t>
+      </w:r>
+      <w:r>
+        <w:rPr>
+          <w:rStyle w:val="VerbatimChar"/>
+        </w:rPr>
+        <w:t xml:space="preserve">CM-CODEGRAPH-UPGRADE-PROBE-GATED</w:t>
+      </w:r>
+      <w:r>
+        <w:t xml:space="preserve"> </w:t>
+      </w:r>
+      <w:r>
+        <w:t xml:space="preserve">/</w:t>
+      </w:r>
+      <w:r>
+        <w:t xml:space="preserve"> </w:t>
+      </w:r>
+      <w:r>
+        <w:rPr>
+          <w:rStyle w:val="VerbatimChar"/>
+        </w:rPr>
+        <w:t xml:space="preserve">CM-CODEGRAPH-WRITER-EXCLUSIVE</w:t>
+      </w:r>
+      <w:r>
+        <w:t xml:space="preserve"> </w:t>
+      </w:r>
+      <w:r>
+        <w:t xml:space="preserve">/</w:t>
+      </w:r>
+      <w:r>
+        <w:t xml:space="preserve"> </w:t>
+      </w:r>
+      <w:r>
+        <w:rPr>
+          <w:rStyle w:val="VerbatimChar"/>
+        </w:rPr>
+        <w:t xml:space="preserve">CM-CODEGRAPH-BULK-BY-BACKLOG</w:t>
+      </w:r>
+      <w:r>
+        <w:t xml:space="preserve"> </w:t>
+      </w:r>
+      <w:r>
+        <w:t xml:space="preserve">/</w:t>
+      </w:r>
+      <w:r>
+        <w:t xml:space="preserve"> </w:t>
+      </w:r>
+      <w:r>
+        <w:rPr>
+          <w:rStyle w:val="VerbatimChar"/>
+        </w:rPr>
+        <w:t xml:space="preserve">CM-CODEGRAPH-STALL-WATCHDOG</w:t>
+      </w:r>
+      <w:r>
+        <w:t xml:space="preserve"> </w:t>
+      </w:r>
+      <w:r>
+        <w:t xml:space="preserve">+ paired §1.1 mutations (enabled-undeclared server, ready with pending &gt; 0, reduction without wrong-answer list, unloaded model, bulk-by-rows, dropped liveness check → each gate MUST FAIL; golden-FALSE: unchanged complete reachable index fires none). Gate CODE = separate work item, NOT claimed shipped (§11.4.6 / §11.4.227).</w:t>
+      </w:r>
+      <w:r>
+        <w:t xml:space="preserve"> </w:t>
+      </w:r>
+      <w:r>
+        <w:rPr>
+          <w:b/>
+          <w:bCs/>
+        </w:rPr>
+        <w:t xml:space="preserve">Canonical authority:</w:t>
+      </w:r>
+      <w:r>
+        <w:t xml:space="preserve"> </w:t>
+      </w:r>
+      <w:r>
+        <w:t xml:space="preserve">constitution submodule</w:t>
+      </w:r>
+      <w:r>
+        <w:t xml:space="preserve"> </w:t>
+      </w:r>
+      <w:hyperlink r:id="rId10">
+        <w:r>
+          <w:rPr>
+            <w:rStyle w:val="VerbatimChar"/>
+          </w:rPr>
+          <w:t xml:space="preserve">Constitution.md</w:t>
+        </w:r>
+      </w:hyperlink>
+      <w:r>
+        <w:t xml:space="preserve"> </w:t>
+      </w:r>
+      <w:r>
+        <w:t xml:space="preserve">§11.4.275. Non-compliance is a release blocker. No escape hatch — no</w:t>
+      </w:r>
+      <w:r>
+        <w:t xml:space="preserve"> </w:t>
+      </w:r>
+      <w:r>
+        <w:rPr>
+          <w:rStyle w:val="VerbatimChar"/>
+        </w:rPr>
+        <w:t xml:space="preserve">--index-partial-ready</w:t>
+      </w:r>
+      <w:r>
+        <w:t xml:space="preserve">,</w:t>
+      </w:r>
+      <w:r>
+        <w:t xml:space="preserve"> </w:t>
+      </w:r>
+      <w:r>
+        <w:rPr>
+          <w:rStyle w:val="VerbatimChar"/>
+        </w:rPr>
+        <w:t xml:space="preserve">--enabled-is-declared</w:t>
+      </w:r>
+      <w:r>
+        <w:t xml:space="preserve">,</w:t>
+      </w:r>
+      <w:r>
+        <w:t xml:space="preserve"> </w:t>
+      </w:r>
+      <w:r>
+        <w:rPr>
+          <w:rStyle w:val="VerbatimChar"/>
+        </w:rPr>
+        <w:t xml:space="preserve">--main-session-only-index</w:t>
+      </w:r>
+      <w:r>
+        <w:t xml:space="preserve">,</w:t>
+      </w:r>
+      <w:r>
+        <w:t xml:space="preserve"> </w:t>
+      </w:r>
+      <w:r>
+        <w:rPr>
+          <w:rStyle w:val="VerbatimChar"/>
+        </w:rPr>
+        <w:t xml:space="preserve">--skip-model-proof</w:t>
+      </w:r>
+      <w:r>
+        <w:t xml:space="preserve">,</w:t>
+      </w:r>
+      <w:r>
+        <w:t xml:space="preserve"> </w:t>
+      </w:r>
+      <w:r>
+        <w:rPr>
+          <w:rStyle w:val="VerbatimChar"/>
+        </w:rPr>
+        <w:t xml:space="preserve">--reduction-without-wrong-answers</w:t>
+      </w:r>
+      <w:r>
+        <w:t xml:space="preserve">,</w:t>
+      </w:r>
+      <w:r>
+        <w:t xml:space="preserve"> </w:t>
+      </w:r>
+      <w:r>
+        <w:rPr>
+          <w:rStyle w:val="VerbatimChar"/>
+        </w:rPr>
+        <w:t xml:space="preserve">--bulk-by-row-count</w:t>
+      </w:r>
+      <w:r>
+        <w:t xml:space="preserve">,</w:t>
+      </w:r>
+      <w:r>
+        <w:t xml:space="preserve"> </w:t>
+      </w:r>
+      <w:r>
+        <w:rPr>
+          <w:rStyle w:val="VerbatimChar"/>
+        </w:rPr>
+        <w:t xml:space="preserve">--lock-age-is-liveness</w:t>
+      </w:r>
+      <w:r>
+        <w:t xml:space="preserve"> </w:t>
+      </w:r>
+      <w:r>
+        <w:t xml:space="preserve">flag.</w:t>
+      </w:r>
+    </w:p>
+    <w:p>
+      <w:pPr>
+        <w:pStyle w:val="BodyText"/>
+      </w:pPr>
+      <w:r>
+        <w:rPr>
+          <w:b/>
+          <w:bCs/>
+        </w:rPr>
+        <w:t xml:space="preserve">EXTENSION landed 2026-09-24 — §11.4.78 / §11.4.79 / §11.4.80 indexing mechanism is consumed BY REFERENCE; the consumer supplies only DATA (full text in</w:t>
+      </w:r>
+      <w:r>
+        <w:rPr>
+          <w:b/>
+          <w:bCs/>
+        </w:rPr>
+        <w:t xml:space="preserve"> </w:t>
+      </w:r>
+      <w:r>
+        <w:rPr>
+          <w:rStyle w:val="VerbatimChar"/>
+          <w:b/>
+          <w:bCs/>
+        </w:rPr>
+        <w:t xml:space="preserve">Constitution.md</w:t>
+      </w:r>
+      <w:r>
+        <w:rPr>
+          <w:b/>
+          <w:bCs/>
+        </w:rPr>
+        <w:t xml:space="preserve">).</w:t>
+      </w:r>
+      <w:r>
+        <w:t xml:space="preserve"> </w:t>
+      </w:r>
+      <w:r>
+        <w:t xml:space="preserve">This carrier cites the three anchors; it is not a second block-start for any of them (§11.4.227(B)).</w:t>
+      </w:r>
+      <w:r>
+        <w:t xml:space="preserve"> </w:t>
+      </w:r>
+      <w:r>
+        <w:rPr>
+          <w:b/>
+          <w:bCs/>
+        </w:rPr>
+        <w:t xml:space="preserve">§11.4.78(7)-(10):</w:t>
+      </w:r>
+      <w:r>
+        <w:t xml:space="preserve"> </w:t>
+      </w:r>
+      <w:r>
+        <w:t xml:space="preserve">the scope renderer (</w:t>
+      </w:r>
+      <w:r>
+        <w:rPr>
+          <w:rStyle w:val="VerbatimChar"/>
+        </w:rPr>
+        <w:t xml:space="preserve">&lt;constitution&gt;/scripts/codegraph/scope_render.py</w:t>
+      </w:r>
+      <w:r>
+        <w:t xml:space="preserve"> </w:t>
+      </w:r>
+      <w:r>
+        <w:t xml:space="preserve">+</w:t>
+      </w:r>
+      <w:r>
+        <w:t xml:space="preserve"> </w:t>
+      </w:r>
+      <w:r>
+        <w:rPr>
+          <w:rStyle w:val="VerbatimChar"/>
+        </w:rPr>
+        <w:t xml:space="preserve">scope_enumerate.js</w:t>
+      </w:r>
+      <w:r>
+        <w:t xml:space="preserve"> </w:t>
+      </w:r>
+      <w:r>
+        <w:t xml:space="preserve">+</w:t>
+      </w:r>
+      <w:r>
+        <w:t xml:space="preserve"> </w:t>
+      </w:r>
+      <w:r>
+        <w:rPr>
+          <w:rStyle w:val="VerbatimChar"/>
+        </w:rPr>
+        <w:t xml:space="preserve">scope_baseline.txt</w:t>
+      </w:r>
+      <w:r>
+        <w:t xml:space="preserve"> </w:t>
+      </w:r>
+      <w:r>
+        <w:t xml:space="preserve">+ template</w:t>
+      </w:r>
+      <w:r>
+        <w:t xml:space="preserve"> </w:t>
+      </w:r>
+      <w:r>
+        <w:rPr>
+          <w:rStyle w:val="VerbatimChar"/>
+        </w:rPr>
+        <w:t xml:space="preserve">scope.example.yaml</w:t>
+      </w:r>
+      <w:r>
+        <w:t xml:space="preserve">), the single writer entry (</w:t>
+      </w:r>
+      <w:r>
+        <w:rPr>
+          <w:rStyle w:val="VerbatimChar"/>
+        </w:rPr>
+        <w:t xml:space="preserve">codegraph_safe.sh</w:t>
+      </w:r>
+      <w:r>
+        <w:t xml:space="preserve"> </w:t>
+      </w:r>
+      <w:r>
+        <w:t xml:space="preserve">+ helper/guard/disk tripwire), the version-keyed runner patcher (</w:t>
+      </w:r>
+      <w:r>
+        <w:rPr>
+          <w:rStyle w:val="VerbatimChar"/>
+        </w:rPr>
+        <w:t xml:space="preserve">fk_index_patch.py</w:t>
+      </w:r>
+      <w:r>
+        <w:t xml:space="preserve"> </w:t>
+      </w:r>
+      <w:r>
+        <w:t xml:space="preserve">+</w:t>
+      </w:r>
+      <w:r>
+        <w:t xml:space="preserve"> </w:t>
+      </w:r>
+      <w:r>
+        <w:rPr>
+          <w:rStyle w:val="VerbatimChar"/>
+        </w:rPr>
+        <w:t xml:space="preserve">runner_patches/</w:t>
+      </w:r>
+      <w:r>
+        <w:t xml:space="preserve">), the hazard probe (</w:t>
+      </w:r>
+      <w:r>
+        <w:rPr>
+          <w:rStyle w:val="VerbatimChar"/>
+        </w:rPr>
+        <w:t xml:space="preserve">fk_cascade_probe.py</w:t>
+      </w:r>
+      <w:r>
+        <w:t xml:space="preserve">), the progress-proven watchdog (</w:t>
+      </w:r>
+      <w:r>
+        <w:rPr>
+          <w:rStyle w:val="VerbatimChar"/>
+        </w:rPr>
+        <w:t xml:space="preserve">index_watch.py</w:t>
+      </w:r>
+      <w:r>
+        <w:t xml:space="preserve">), the scope proof (</w:t>
+      </w:r>
+      <w:r>
+        <w:rPr>
+          <w:rStyle w:val="VerbatimChar"/>
+        </w:rPr>
+        <w:t xml:space="preserve">codegraph_scope_guard.py</w:t>
+      </w:r>
+      <w:r>
+        <w:t xml:space="preserve">) and</w:t>
+      </w:r>
+      <w:r>
+        <w:t xml:space="preserve"> </w:t>
+      </w:r>
+      <w:r>
+        <w:rPr>
+          <w:rStyle w:val="VerbatimChar"/>
+        </w:rPr>
+        <w:t xml:space="preserve">scripts/lumen/gen_lumenignore.py</w:t>
+      </w:r>
+      <w:r>
+        <w:t xml:space="preserve"> </w:t>
+      </w:r>
+      <w:r>
+        <w:t xml:space="preserve">MUST live in the constitution submodule and be invoked BY REFERENCE (§11.4.28 / §11.4.80 / §11.4.177) — a consumer copy/fork/hand-rolled equivalent is a violation; each tool MUST be documented (§11.4.18) and test-first with paired mutations, and an untested tool never touches a live index — at the time of writing</w:t>
+      </w:r>
+      <w:r>
+        <w:t xml:space="preserve"> </w:t>
+      </w:r>
+      <w:r>
+        <w:rPr>
+          <w:rStyle w:val="VerbatimChar"/>
+        </w:rPr>
+        <w:t xml:space="preserve">index_watch.py</w:t>
+      </w:r>
+      <w:r>
+        <w:t xml:space="preserve"> </w:t>
+      </w:r>
+      <w:r>
+        <w:t xml:space="preserve">and</w:t>
+      </w:r>
+      <w:r>
+        <w:t xml:space="preserve"> </w:t>
+      </w:r>
+      <w:r>
+        <w:rPr>
+          <w:rStyle w:val="VerbatimChar"/>
+        </w:rPr>
+        <w:t xml:space="preserve">fk_cascade_probe.py</w:t>
+      </w:r>
+      <w:r>
+        <w:t xml:space="preserve"> </w:t>
+      </w:r>
+      <w:r>
+        <w:t xml:space="preserve">(no test references of their own — the writer entry's unit test substitutes a stub for the probe), the runner patches</w:t>
+      </w:r>
+      <w:r>
+        <w:t xml:space="preserve"> </w:t>
+      </w:r>
+      <w:r>
+        <w:rPr>
+          <w:rStyle w:val="VerbatimChar"/>
+        </w:rPr>
+        <w:t xml:space="preserve">lockfix1</w:t>
+      </w:r>
+      <w:r>
+        <w:t xml:space="preserve"> </w:t>
+      </w:r>
+      <w:r>
+        <w:t xml:space="preserve">and</w:t>
+      </w:r>
+      <w:r>
+        <w:t xml:space="preserve"> </w:t>
+      </w:r>
+      <w:r>
+        <w:rPr>
+          <w:rStyle w:val="VerbatimChar"/>
+        </w:rPr>
+        <w:t xml:space="preserve">datafrag1</w:t>
+      </w:r>
+      <w:r>
+        <w:t xml:space="preserve"> </w:t>
+      </w:r>
+      <w:r>
+        <w:t xml:space="preserve">(no tests of their own — excluded from the default patch set for that reason), and the §11.4.18 companion guide of EVERY tool named here (none exists yet) are OWED, tracked per §11.4.197; the consumer supplies ONE scope DATA file (own-org list, project rubbish, pathological inputs, re-include negations, reasoned class overrides, accepted file count + tolerance, efficiency thresholds) and never drops a baseline class; scope truth = the config the INSTALLED CLI version actually loads (from its own loader, §11.4.99), a config the CLI does not read is dead documentation, the effective scope is GENERATED (hand edits refused, silent fall-back = FAIL); before "ready" the scope guard MUST enumerate through the runner's own discovery code and assert count within tolerance, 0 third-party files, 0 secret-class files, ≥1 file per own-org root, each control-needled — database size is NEVER evidence. Where this conflicts with the older clause-2 filter wording, the extension governs.</w:t>
+      </w:r>
+      <w:r>
+        <w:t xml:space="preserve"> </w:t>
+      </w:r>
+      <w:r>
+        <w:rPr>
+          <w:b/>
+          <w:bCs/>
+        </w:rPr>
+        <w:t xml:space="preserve">§11.4.79(6)-(8):</w:t>
+      </w:r>
+      <w:r>
+        <w:t xml:space="preserve"> </w:t>
+      </w:r>
+      <w:r>
+        <w:t xml:space="preserve">own-org vs third-party is DERIVED by walking</w:t>
+      </w:r>
+      <w:r>
+        <w:t xml:space="preserve"> </w:t>
+      </w:r>
+      <w:r>
+        <w:rPr>
+          <w:rStyle w:val="VerbatimChar"/>
+        </w:rPr>
+        <w:t xml:space="preserve">.gitmodules</w:t>
+      </w:r>
+      <w:r>
+        <w:t xml:space="preserve"> </w:t>
+      </w:r>
+      <w:r>
+        <w:t xml:space="preserve">recursively and matching remote-URL organisation against the consumer own-org DATA; third-party code nested inside an own-org submodule is third-party; a gitlink change without re-render makes the render stale and the guard FAILs; steps 2–3 now mean "edit scope DATA + re-render + re-index only through the single writer entry".</w:t>
+      </w:r>
+      <w:r>
+        <w:t xml:space="preserve"> </w:t>
+      </w:r>
+      <w:r>
+        <w:rPr>
+          <w:b/>
+          <w:bCs/>
+        </w:rPr>
+        <w:t xml:space="preserve">§11.4.80(4)-(8):</w:t>
+      </w:r>
+      <w:r>
+        <w:t xml:space="preserve"> </w:t>
+      </w:r>
+      <w:r>
+        <w:t xml:space="preserve">upgrades are gated on a compatibility probe (loader config filename/keys, bulk-window hazard probe, runner-patch applicability) and REFUSE loudly keeping the prior version when the patched runner cannot be re-proven (§11.4.201); a runner patch without its own RED→GREEN test + paired mutation + byte-copy equivalence proof never touches a live index; every init/index/sync goes through the ONE writer entry, which MUST refuse while any live process targets the root (real cmdline §11.4.196(D), whatever the lock's age), classify BULK by PENDING backlog never by stored rows, and run bulk only on the proven patched runner, detached, watchdog- and tripwire-supervised; long runs are progress-proven (§11.4.232(C)) — alive-but-not-advancing is a STALL; cadence is a real timer/hook + constitution-pull hook (§11.4.164) with a ledger entry each run, a missing validator = FAIL; the live</w:t>
+      </w:r>
+      <w:r>
+        <w:t xml:space="preserve"> </w:t>
+      </w:r>
+      <w:r>
+        <w:rPr>
+          <w:rStyle w:val="VerbatimChar"/>
+        </w:rPr>
+        <w:t xml:space="preserve">codegraph help</w:t>
+      </w:r>
+      <w:r>
+        <w:t xml:space="preserve"> </w:t>
+      </w:r>
+      <w:r>
+        <w:t xml:space="preserve">diff is authoritative over the embedded list, and telemetry MUST be off (per-host FACT, captured not assumed). The literals</w:t>
+      </w:r>
+      <w:r>
+        <w:t xml:space="preserve"> </w:t>
+      </w:r>
+      <w:r>
+        <w:rPr>
+          <w:rStyle w:val="VerbatimChar"/>
+        </w:rPr>
+        <w:t xml:space="preserve">11.4.78</w:t>
+      </w:r>
+      <w:r>
+        <w:t xml:space="preserve"> </w:t>
+      </w:r>
+      <w:r>
+        <w:t xml:space="preserve">/</w:t>
+      </w:r>
+      <w:r>
+        <w:t xml:space="preserve"> </w:t>
+      </w:r>
+      <w:r>
+        <w:rPr>
+          <w:rStyle w:val="VerbatimChar"/>
+        </w:rPr>
+        <w:t xml:space="preserve">11.4.79</w:t>
+      </w:r>
+      <w:r>
+        <w:t xml:space="preserve"> </w:t>
+      </w:r>
+      <w:r>
+        <w:t xml:space="preserve">/</w:t>
+      </w:r>
+      <w:r>
+        <w:t xml:space="preserve"> </w:t>
+      </w:r>
+      <w:r>
+        <w:rPr>
+          <w:rStyle w:val="VerbatimChar"/>
+        </w:rPr>
+        <w:t xml:space="preserve">11.4.80</w:t>
+      </w:r>
+      <w:r>
+        <w:t xml:space="preserve"> </w:t>
+      </w:r>
+      <w:r>
+        <w:t xml:space="preserve">are unchanged; no</w:t>
+      </w:r>
+      <w:r>
+        <w:t xml:space="preserve"> </w:t>
+      </w:r>
+      <w:r>
+        <w:rPr>
+          <w:rStyle w:val="VerbatimChar"/>
+        </w:rPr>
+        <w:t xml:space="preserve">CM-COVENANT-114-78/79/80-PROPAGATION</w:t>
+      </w:r>
+      <w:r>
+        <w:t xml:space="preserve"> </w:t>
+      </w:r>
+      <w:r>
+        <w:t xml:space="preserve">gate exists (none in</w:t>
+      </w:r>
+      <w:r>
+        <w:t xml:space="preserve"> </w:t>
+      </w:r>
+      <w:r>
+        <w:rPr>
+          <w:rStyle w:val="VerbatimChar"/>
+        </w:rPr>
+        <w:t xml:space="preserve">constitution/scripts/gates/</w:t>
+      </w:r>
+      <w:r>
+        <w:t xml:space="preserve">), so no propagation gate is claimed for them.</w:t>
       </w:r>
     </w:p>
     <w:bookmarkEnd w:id="20"/>

</xml_diff>